<commit_message>
feat(Modification Rapport): Modification de l'introduction du rapport
</commit_message>
<xml_diff>
--- a/doc/R-320-Fankhauser-OO_them_all.docx
+++ b/doc/R-320-Fankhauser-OO_them_all.docx
@@ -540,7 +540,13 @@
     <w:sdt>
       <w:sdtPr>
         <w:rPr>
-          <w:lang w:val="fr-FR"/>
+          <w:rFonts w:asciiTheme="minorHAnsi" w:eastAsiaTheme="minorHAnsi" w:hAnsiTheme="minorHAnsi" w:cstheme="minorBidi"/>
+          <w:color w:val="auto"/>
+          <w:kern w:val="2"/>
+          <w:sz w:val="24"/>
+          <w:szCs w:val="24"/>
+          <w:lang w:val="fr-FR" w:eastAsia="en-US"/>
+          <w14:ligatures w14:val="standardContextual"/>
         </w:rPr>
         <w:id w:val="-400135287"/>
         <w:docPartObj>
@@ -550,15 +556,8 @@
       </w:sdtPr>
       <w:sdtEndPr>
         <w:rPr>
-          <w:rFonts w:asciiTheme="minorHAnsi" w:eastAsiaTheme="minorHAnsi" w:hAnsiTheme="minorHAnsi" w:cstheme="minorBidi"/>
           <w:b/>
           <w:bCs/>
-          <w:color w:val="auto"/>
-          <w:kern w:val="2"/>
-          <w:sz w:val="24"/>
-          <w:szCs w:val="24"/>
-          <w:lang w:eastAsia="en-US"/>
-          <w14:ligatures w14:val="standardContextual"/>
         </w:rPr>
       </w:sdtEndPr>
       <w:sdtContent>
@@ -756,10 +755,30 @@
     </w:p>
     <w:p>
       <w:pPr>
+        <w:pStyle w:val="Titre2"/>
+      </w:pPr>
+      <w:r>
+        <w:t>Objectifs pédagogiques</w:t>
+      </w:r>
+    </w:p>
+    <w:p>
+      <w:pPr>
         <w:pStyle w:val="Standard"/>
       </w:pPr>
       <w:r>
-        <w:t xml:space="preserve">Dans le cadre du Projet 320, je vais réaliser un programme de simulation d’un bancomat. Au travers de ce projet nous utiliserons ce projet pour découvrir le system de branchement dans </w:t>
+        <w:t xml:space="preserve">Dans le cadre du Projet 320, je vais réaliser un programme de simulation d’un bancomat. Au travers de ce projet </w:t>
+      </w:r>
+      <w:r>
+        <w:t>nous allons</w:t>
+      </w:r>
+      <w:r>
+        <w:t xml:space="preserve"> découvrir le system de branchement </w:t>
+      </w:r>
+      <w:r>
+        <w:t xml:space="preserve">et en général le fonctionnement des repository </w:t>
+      </w:r>
+      <w:r>
+        <w:t xml:space="preserve">dans </w:t>
       </w:r>
       <w:proofErr w:type="spellStart"/>
       <w:r>
@@ -772,7 +791,7 @@
     </w:p>
     <w:p>
       <w:pPr>
-        <w:pStyle w:val="Titre1"/>
+        <w:pStyle w:val="Titre2"/>
       </w:pPr>
       <w:bookmarkStart w:id="1" w:name="_Toc219296473"/>
       <w:r>
@@ -786,6 +805,9 @@
       </w:pPr>
       <w:r>
         <w:t>Mon choix s’est porté sur comme je l’ai mentionné précédemment une simulation de bancomat.</w:t>
+      </w:r>
+      <w:r>
+        <w:t xml:space="preserve"> Car je me suis dit que cela pouvait être un programme dans lequel je pourrais essayer de faire un bon visuel dans le menu et dans les prochaines section.</w:t>
       </w:r>
     </w:p>
     <w:sectPr>
@@ -2098,14 +2120,6 @@
 </file>
 
 <file path=customXml/item1.xml><?xml version="1.0" encoding="utf-8"?>
-<p:properties xmlns:p="http://schemas.microsoft.com/office/2006/metadata/properties" xmlns:xsi="http://www.w3.org/2001/XMLSchema-instance" xmlns:pc="http://schemas.microsoft.com/office/infopath/2007/PartnerControls">
-  <documentManagement>
-    <_activity xmlns="83f9d718-8695-44fe-93c7-a4e5ea258f1b" xsi:nil="true"/>
-  </documentManagement>
-</p:properties>
-</file>
-
-<file path=customXml/item2.xml><?xml version="1.0" encoding="utf-8"?>
 <?mso-contentType ?>
 <FormTemplates xmlns="http://schemas.microsoft.com/sharepoint/v3/contenttype/forms">
   <Display>DocumentLibraryForm</Display>
@@ -2114,7 +2128,19 @@
 </FormTemplates>
 </file>
 
+<file path=customXml/item2.xml><?xml version="1.0" encoding="utf-8"?>
+<p:properties xmlns:p="http://schemas.microsoft.com/office/2006/metadata/properties" xmlns:xsi="http://www.w3.org/2001/XMLSchema-instance" xmlns:pc="http://schemas.microsoft.com/office/infopath/2007/PartnerControls">
+  <documentManagement>
+    <_activity xmlns="83f9d718-8695-44fe-93c7-a4e5ea258f1b" xsi:nil="true"/>
+  </documentManagement>
+</p:properties>
+</file>
+
 <file path=customXml/item3.xml><?xml version="1.0" encoding="utf-8"?>
+<b:Sources xmlns:b="http://schemas.openxmlformats.org/officeDocument/2006/bibliography" xmlns="http://schemas.openxmlformats.org/officeDocument/2006/bibliography" SelectedStyle="\APASixthEditionOfficeOnline.xsl" StyleName="APA" Version="6"/>
+</file>
+
+<file path=customXml/item4.xml><?xml version="1.0" encoding="utf-8"?>
 <ct:contentTypeSchema xmlns:ct="http://schemas.microsoft.com/office/2006/metadata/contentType" xmlns:ma="http://schemas.microsoft.com/office/2006/metadata/properties/metaAttributes" ct:_="" ma:_="" ma:contentTypeName="Document" ma:contentTypeID="0x0101008FCB22F1547D7D4F82919EC743CAACBC" ma:contentTypeVersion="17" ma:contentTypeDescription="Crée un document." ma:contentTypeScope="" ma:versionID="aa8a16242235505fd8e8c3689b4ff504">
   <xsd:schema xmlns:xsd="http://www.w3.org/2001/XMLSchema" xmlns:xs="http://www.w3.org/2001/XMLSchema" xmlns:p="http://schemas.microsoft.com/office/2006/metadata/properties" xmlns:ns3="83f9d718-8695-44fe-93c7-a4e5ea258f1b" xmlns:ns4="aaa9772f-a032-4180-ab8e-8699b78d9e7a" targetNamespace="http://schemas.microsoft.com/office/2006/metadata/properties" ma:root="true" ma:fieldsID="508dcb9d59a7003de944be2c00e12f88" ns3:_="" ns4:_="">
     <xsd:import namespace="83f9d718-8695-44fe-93c7-a4e5ea258f1b"/>
@@ -2361,11 +2387,15 @@
 </ct:contentTypeSchema>
 </file>
 
-<file path=customXml/item4.xml><?xml version="1.0" encoding="utf-8"?>
-<b:Sources xmlns:b="http://schemas.openxmlformats.org/officeDocument/2006/bibliography" xmlns="http://schemas.openxmlformats.org/officeDocument/2006/bibliography" SelectedStyle="\APASixthEditionOfficeOnline.xsl" StyleName="APA" Version="6"/>
+<file path=customXml/itemProps1.xml><?xml version="1.0" encoding="utf-8"?>
+<ds:datastoreItem xmlns:ds="http://schemas.openxmlformats.org/officeDocument/2006/customXml" ds:itemID="{3F059DC9-A0F2-46E5-9FF4-94E5C580138D}">
+  <ds:schemaRefs>
+    <ds:schemaRef ds:uri="http://schemas.microsoft.com/sharepoint/v3/contenttype/forms"/>
+  </ds:schemaRefs>
+</ds:datastoreItem>
 </file>
 
-<file path=customXml/itemProps1.xml><?xml version="1.0" encoding="utf-8"?>
+<file path=customXml/itemProps2.xml><?xml version="1.0" encoding="utf-8"?>
 <ds:datastoreItem xmlns:ds="http://schemas.openxmlformats.org/officeDocument/2006/customXml" ds:itemID="{03FE21A9-7FCA-4441-94C6-1629FB7A5C57}">
   <ds:schemaRefs>
     <ds:schemaRef ds:uri="http://schemas.microsoft.com/office/2006/metadata/properties"/>
@@ -2375,15 +2405,15 @@
 </ds:datastoreItem>
 </file>
 
-<file path=customXml/itemProps2.xml><?xml version="1.0" encoding="utf-8"?>
-<ds:datastoreItem xmlns:ds="http://schemas.openxmlformats.org/officeDocument/2006/customXml" ds:itemID="{3F059DC9-A0F2-46E5-9FF4-94E5C580138D}">
+<file path=customXml/itemProps3.xml><?xml version="1.0" encoding="utf-8"?>
+<ds:datastoreItem xmlns:ds="http://schemas.openxmlformats.org/officeDocument/2006/customXml" ds:itemID="{8D5DC332-1805-4342-B2BA-89BF91289DE0}">
   <ds:schemaRefs>
-    <ds:schemaRef ds:uri="http://schemas.microsoft.com/sharepoint/v3/contenttype/forms"/>
+    <ds:schemaRef ds:uri="http://schemas.openxmlformats.org/officeDocument/2006/bibliography"/>
   </ds:schemaRefs>
 </ds:datastoreItem>
 </file>
 
-<file path=customXml/itemProps3.xml><?xml version="1.0" encoding="utf-8"?>
+<file path=customXml/itemProps4.xml><?xml version="1.0" encoding="utf-8"?>
 <ds:datastoreItem xmlns:ds="http://schemas.openxmlformats.org/officeDocument/2006/customXml" ds:itemID="{2C612DAB-883E-427E-82DE-EEBD0984ED6D}">
   <ds:schemaRefs>
     <ds:schemaRef ds:uri="http://schemas.microsoft.com/office/2006/metadata/contentType"/>
@@ -2400,12 +2430,4 @@
     <ds:schemaRef ds:uri="http://schemas.microsoft.com/internal/obd"/>
   </ds:schemaRefs>
 </ds:datastoreItem>
-</file>
-
-<file path=customXml/itemProps4.xml><?xml version="1.0" encoding="utf-8"?>
-<ds:datastoreItem xmlns:ds="http://schemas.openxmlformats.org/officeDocument/2006/customXml" ds:itemID="{8D5DC332-1805-4342-B2BA-89BF91289DE0}">
-  <ds:schemaRefs>
-    <ds:schemaRef ds:uri="http://schemas.openxmlformats.org/officeDocument/2006/bibliography"/>
-  </ds:schemaRefs>
-</ds:datastoreItem>
 </file>
</xml_diff>

<commit_message>
chore(Report Finished): Finished the report for the final release
</commit_message>
<xml_diff>
--- a/doc/R-320-Fankhauser-OO_them_all.docx
+++ b/doc/R-320-Fankhauser-OO_them_all.docx
@@ -120,7 +120,7 @@
                                                     <pic:cNvPicPr/>
                                                   </pic:nvPicPr>
                                                   <pic:blipFill>
-                                                    <a:blip r:embed="rId8" cstate="print">
+                                                    <a:blip r:embed="rId10" cstate="print">
                                                       <a:extLst>
                                                         <a:ext uri="{28A0092B-C50C-407E-A947-70E740481C1C}">
                                                           <a14:useLocalDpi xmlns:a14="http://schemas.microsoft.com/office/drawing/2010/main" val="0"/>
@@ -252,31 +252,6 @@
                                         </w:p>
                                       </w:sdtContent>
                                     </w:sdt>
-                                    <w:p>
-                                      <w:pPr>
-                                        <w:pStyle w:val="Sansinterligne"/>
-                                      </w:pPr>
-                                      <w:sdt>
-                                        <w:sdtPr>
-                                          <w:rPr>
-                                            <w:color w:val="0E2841" w:themeColor="text2"/>
-                                          </w:rPr>
-                                          <w:alias w:val="Cours"/>
-                                          <w:tag w:val="Cours"/>
-                                          <w:id w:val="-710501431"/>
-                                          <w:dataBinding w:prefixMappings="xmlns:ns0='http://purl.org/dc/elements/1.1/' xmlns:ns1='http://schemas.openxmlformats.org/package/2006/metadata/core-properties' " w:xpath="/ns1:coreProperties[1]/ns1:category[1]" w:storeItemID="{6C3C8BC8-F283-45AE-878A-BAB7291924A1}"/>
-                                          <w:text/>
-                                        </w:sdtPr>
-                                        <w:sdtContent>
-                                          <w:r>
-                                            <w:rPr>
-                                              <w:color w:val="0E2841" w:themeColor="text2"/>
-                                            </w:rPr>
-                                            <w:t>Projet 320</w:t>
-                                          </w:r>
-                                        </w:sdtContent>
-                                      </w:sdt>
-                                    </w:p>
                                   </w:tc>
                                 </w:tr>
                               </w:tbl>
@@ -362,7 +337,7 @@
                                               <pic:cNvPicPr/>
                                             </pic:nvPicPr>
                                             <pic:blipFill>
-                                              <a:blip r:embed="rId8" cstate="print">
+                                              <a:blip r:embed="rId10" cstate="print">
                                                 <a:extLst>
                                                   <a:ext uri="{28A0092B-C50C-407E-A947-70E740481C1C}">
                                                     <a14:useLocalDpi xmlns:a14="http://schemas.microsoft.com/office/drawing/2010/main" val="0"/>
@@ -494,31 +469,6 @@
                                   </w:p>
                                 </w:sdtContent>
                               </w:sdt>
-                              <w:p>
-                                <w:pPr>
-                                  <w:pStyle w:val="Sansinterligne"/>
-                                </w:pPr>
-                                <w:sdt>
-                                  <w:sdtPr>
-                                    <w:rPr>
-                                      <w:color w:val="0E2841" w:themeColor="text2"/>
-                                    </w:rPr>
-                                    <w:alias w:val="Cours"/>
-                                    <w:tag w:val="Cours"/>
-                                    <w:id w:val="-710501431"/>
-                                    <w:dataBinding w:prefixMappings="xmlns:ns0='http://purl.org/dc/elements/1.1/' xmlns:ns1='http://schemas.openxmlformats.org/package/2006/metadata/core-properties' " w:xpath="/ns1:coreProperties[1]/ns1:category[1]" w:storeItemID="{6C3C8BC8-F283-45AE-878A-BAB7291924A1}"/>
-                                    <w:text/>
-                                  </w:sdtPr>
-                                  <w:sdtContent>
-                                    <w:r>
-                                      <w:rPr>
-                                        <w:color w:val="0E2841" w:themeColor="text2"/>
-                                      </w:rPr>
-                                      <w:t>Projet 320</w:t>
-                                    </w:r>
-                                  </w:sdtContent>
-                                </w:sdt>
-                              </w:p>
                             </w:tc>
                           </w:tr>
                         </w:tbl>
@@ -579,7 +529,9 @@
               <w:tab w:val="right" w:leader="dot" w:pos="9062"/>
             </w:tabs>
             <w:rPr>
+              <w:rFonts w:eastAsiaTheme="minorEastAsia"/>
               <w:noProof/>
+              <w:lang w:eastAsia="fr-CH"/>
             </w:rPr>
           </w:pPr>
           <w:r>
@@ -591,7 +543,7 @@
           <w:r>
             <w:fldChar w:fldCharType="separate"/>
           </w:r>
-          <w:hyperlink w:anchor="_Toc219296472" w:history="1">
+          <w:hyperlink w:anchor="_Toc224285644" w:history="1">
             <w:r>
               <w:rPr>
                 <w:rStyle w:val="Lienhypertexte"/>
@@ -618,7 +570,147 @@
                 <w:noProof/>
                 <w:webHidden/>
               </w:rPr>
-              <w:instrText xml:space="preserve"> PAGEREF _Toc219296472 \h </w:instrText>
+              <w:instrText xml:space="preserve"> PAGEREF _Toc224285644 \h </w:instrText>
+            </w:r>
+            <w:r>
+              <w:rPr>
+                <w:noProof/>
+                <w:webHidden/>
+              </w:rPr>
+            </w:r>
+            <w:r>
+              <w:rPr>
+                <w:noProof/>
+                <w:webHidden/>
+              </w:rPr>
+              <w:fldChar w:fldCharType="separate"/>
+            </w:r>
+            <w:r>
+              <w:rPr>
+                <w:noProof/>
+                <w:webHidden/>
+              </w:rPr>
+              <w:t>2</w:t>
+            </w:r>
+            <w:r>
+              <w:rPr>
+                <w:noProof/>
+                <w:webHidden/>
+              </w:rPr>
+              <w:fldChar w:fldCharType="end"/>
+            </w:r>
+          </w:hyperlink>
+        </w:p>
+        <w:p>
+          <w:pPr>
+            <w:pStyle w:val="TM2"/>
+            <w:tabs>
+              <w:tab w:val="right" w:leader="dot" w:pos="9062"/>
+            </w:tabs>
+            <w:rPr>
+              <w:rFonts w:eastAsiaTheme="minorEastAsia"/>
+              <w:noProof/>
+              <w:lang w:eastAsia="fr-CH"/>
+            </w:rPr>
+          </w:pPr>
+          <w:hyperlink w:anchor="_Toc224285645" w:history="1">
+            <w:r>
+              <w:rPr>
+                <w:rStyle w:val="Lienhypertexte"/>
+                <w:noProof/>
+              </w:rPr>
+              <w:t>Objectifs pédagogiques</w:t>
+            </w:r>
+            <w:r>
+              <w:rPr>
+                <w:noProof/>
+                <w:webHidden/>
+              </w:rPr>
+              <w:tab/>
+            </w:r>
+            <w:r>
+              <w:rPr>
+                <w:noProof/>
+                <w:webHidden/>
+              </w:rPr>
+              <w:fldChar w:fldCharType="begin"/>
+            </w:r>
+            <w:r>
+              <w:rPr>
+                <w:noProof/>
+                <w:webHidden/>
+              </w:rPr>
+              <w:instrText xml:space="preserve"> PAGEREF _Toc224285645 \h </w:instrText>
+            </w:r>
+            <w:r>
+              <w:rPr>
+                <w:noProof/>
+                <w:webHidden/>
+              </w:rPr>
+            </w:r>
+            <w:r>
+              <w:rPr>
+                <w:noProof/>
+                <w:webHidden/>
+              </w:rPr>
+              <w:fldChar w:fldCharType="separate"/>
+            </w:r>
+            <w:r>
+              <w:rPr>
+                <w:noProof/>
+                <w:webHidden/>
+              </w:rPr>
+              <w:t>2</w:t>
+            </w:r>
+            <w:r>
+              <w:rPr>
+                <w:noProof/>
+                <w:webHidden/>
+              </w:rPr>
+              <w:fldChar w:fldCharType="end"/>
+            </w:r>
+          </w:hyperlink>
+        </w:p>
+        <w:p>
+          <w:pPr>
+            <w:pStyle w:val="TM2"/>
+            <w:tabs>
+              <w:tab w:val="right" w:leader="dot" w:pos="9062"/>
+            </w:tabs>
+            <w:rPr>
+              <w:rFonts w:eastAsiaTheme="minorEastAsia"/>
+              <w:noProof/>
+              <w:lang w:eastAsia="fr-CH"/>
+            </w:rPr>
+          </w:pPr>
+          <w:hyperlink w:anchor="_Toc224285646" w:history="1">
+            <w:r>
+              <w:rPr>
+                <w:rStyle w:val="Lienhypertexte"/>
+                <w:noProof/>
+              </w:rPr>
+              <w:t>Choix</w:t>
+            </w:r>
+            <w:r>
+              <w:rPr>
+                <w:noProof/>
+                <w:webHidden/>
+              </w:rPr>
+              <w:tab/>
+            </w:r>
+            <w:r>
+              <w:rPr>
+                <w:noProof/>
+                <w:webHidden/>
+              </w:rPr>
+              <w:fldChar w:fldCharType="begin"/>
+            </w:r>
+            <w:r>
+              <w:rPr>
+                <w:noProof/>
+                <w:webHidden/>
+              </w:rPr>
+              <w:instrText xml:space="preserve"> PAGEREF _Toc224285646 \h </w:instrText>
             </w:r>
             <w:r>
               <w:rPr>
@@ -656,16 +748,18 @@
               <w:tab w:val="right" w:leader="dot" w:pos="9062"/>
             </w:tabs>
             <w:rPr>
+              <w:rFonts w:eastAsiaTheme="minorEastAsia"/>
               <w:noProof/>
+              <w:lang w:eastAsia="fr-CH"/>
             </w:rPr>
           </w:pPr>
-          <w:hyperlink w:anchor="_Toc219296473" w:history="1">
+          <w:hyperlink w:anchor="_Toc224285647" w:history="1">
             <w:r>
               <w:rPr>
                 <w:rStyle w:val="Lienhypertexte"/>
                 <w:noProof/>
               </w:rPr>
-              <w:t>Choix</w:t>
+              <w:t>V1-Procédural</w:t>
             </w:r>
             <w:r>
               <w:rPr>
@@ -686,7 +780,7 @@
                 <w:noProof/>
                 <w:webHidden/>
               </w:rPr>
-              <w:instrText xml:space="preserve"> PAGEREF _Toc219296473 \h </w:instrText>
+              <w:instrText xml:space="preserve"> PAGEREF _Toc224285647 \h </w:instrText>
             </w:r>
             <w:r>
               <w:rPr>
@@ -706,7 +800,7 @@
                 <w:noProof/>
                 <w:webHidden/>
               </w:rPr>
-              <w:t>2</w:t>
+              <w:t>3</w:t>
             </w:r>
             <w:r>
               <w:rPr>
@@ -718,6 +812,997 @@
           </w:hyperlink>
         </w:p>
         <w:p>
+          <w:pPr>
+            <w:pStyle w:val="TM2"/>
+            <w:tabs>
+              <w:tab w:val="right" w:leader="dot" w:pos="9062"/>
+            </w:tabs>
+            <w:rPr>
+              <w:rFonts w:eastAsiaTheme="minorEastAsia"/>
+              <w:noProof/>
+              <w:lang w:eastAsia="fr-CH"/>
+            </w:rPr>
+          </w:pPr>
+          <w:hyperlink w:anchor="_Toc224285648" w:history="1">
+            <w:r>
+              <w:rPr>
+                <w:rStyle w:val="Lienhypertexte"/>
+                <w:noProof/>
+              </w:rPr>
+              <w:t>Description</w:t>
+            </w:r>
+            <w:r>
+              <w:rPr>
+                <w:noProof/>
+                <w:webHidden/>
+              </w:rPr>
+              <w:tab/>
+            </w:r>
+            <w:r>
+              <w:rPr>
+                <w:noProof/>
+                <w:webHidden/>
+              </w:rPr>
+              <w:fldChar w:fldCharType="begin"/>
+            </w:r>
+            <w:r>
+              <w:rPr>
+                <w:noProof/>
+                <w:webHidden/>
+              </w:rPr>
+              <w:instrText xml:space="preserve"> PAGEREF _Toc224285648 \h </w:instrText>
+            </w:r>
+            <w:r>
+              <w:rPr>
+                <w:noProof/>
+                <w:webHidden/>
+              </w:rPr>
+            </w:r>
+            <w:r>
+              <w:rPr>
+                <w:noProof/>
+                <w:webHidden/>
+              </w:rPr>
+              <w:fldChar w:fldCharType="separate"/>
+            </w:r>
+            <w:r>
+              <w:rPr>
+                <w:noProof/>
+                <w:webHidden/>
+              </w:rPr>
+              <w:t>3</w:t>
+            </w:r>
+            <w:r>
+              <w:rPr>
+                <w:noProof/>
+                <w:webHidden/>
+              </w:rPr>
+              <w:fldChar w:fldCharType="end"/>
+            </w:r>
+          </w:hyperlink>
+        </w:p>
+        <w:p>
+          <w:pPr>
+            <w:pStyle w:val="TM1"/>
+            <w:tabs>
+              <w:tab w:val="right" w:leader="dot" w:pos="9062"/>
+            </w:tabs>
+            <w:rPr>
+              <w:rFonts w:eastAsiaTheme="minorEastAsia"/>
+              <w:noProof/>
+              <w:lang w:eastAsia="fr-CH"/>
+            </w:rPr>
+          </w:pPr>
+          <w:hyperlink w:anchor="_Toc224285649" w:history="1">
+            <w:r>
+              <w:rPr>
+                <w:rStyle w:val="Lienhypertexte"/>
+                <w:noProof/>
+              </w:rPr>
+              <w:t>V2-Modulaire</w:t>
+            </w:r>
+            <w:r>
+              <w:rPr>
+                <w:noProof/>
+                <w:webHidden/>
+              </w:rPr>
+              <w:tab/>
+            </w:r>
+            <w:r>
+              <w:rPr>
+                <w:noProof/>
+                <w:webHidden/>
+              </w:rPr>
+              <w:fldChar w:fldCharType="begin"/>
+            </w:r>
+            <w:r>
+              <w:rPr>
+                <w:noProof/>
+                <w:webHidden/>
+              </w:rPr>
+              <w:instrText xml:space="preserve"> PAGEREF _Toc224285649 \h </w:instrText>
+            </w:r>
+            <w:r>
+              <w:rPr>
+                <w:noProof/>
+                <w:webHidden/>
+              </w:rPr>
+            </w:r>
+            <w:r>
+              <w:rPr>
+                <w:noProof/>
+                <w:webHidden/>
+              </w:rPr>
+              <w:fldChar w:fldCharType="separate"/>
+            </w:r>
+            <w:r>
+              <w:rPr>
+                <w:noProof/>
+                <w:webHidden/>
+              </w:rPr>
+              <w:t>4</w:t>
+            </w:r>
+            <w:r>
+              <w:rPr>
+                <w:noProof/>
+                <w:webHidden/>
+              </w:rPr>
+              <w:fldChar w:fldCharType="end"/>
+            </w:r>
+          </w:hyperlink>
+        </w:p>
+        <w:p>
+          <w:pPr>
+            <w:pStyle w:val="TM2"/>
+            <w:tabs>
+              <w:tab w:val="right" w:leader="dot" w:pos="9062"/>
+            </w:tabs>
+            <w:rPr>
+              <w:rFonts w:eastAsiaTheme="minorEastAsia"/>
+              <w:noProof/>
+              <w:lang w:eastAsia="fr-CH"/>
+            </w:rPr>
+          </w:pPr>
+          <w:hyperlink w:anchor="_Toc224285650" w:history="1">
+            <w:r>
+              <w:rPr>
+                <w:rStyle w:val="Lienhypertexte"/>
+                <w:noProof/>
+              </w:rPr>
+              <w:t>Description</w:t>
+            </w:r>
+            <w:r>
+              <w:rPr>
+                <w:noProof/>
+                <w:webHidden/>
+              </w:rPr>
+              <w:tab/>
+            </w:r>
+            <w:r>
+              <w:rPr>
+                <w:noProof/>
+                <w:webHidden/>
+              </w:rPr>
+              <w:fldChar w:fldCharType="begin"/>
+            </w:r>
+            <w:r>
+              <w:rPr>
+                <w:noProof/>
+                <w:webHidden/>
+              </w:rPr>
+              <w:instrText xml:space="preserve"> PAGEREF _Toc224285650 \h </w:instrText>
+            </w:r>
+            <w:r>
+              <w:rPr>
+                <w:noProof/>
+                <w:webHidden/>
+              </w:rPr>
+            </w:r>
+            <w:r>
+              <w:rPr>
+                <w:noProof/>
+                <w:webHidden/>
+              </w:rPr>
+              <w:fldChar w:fldCharType="separate"/>
+            </w:r>
+            <w:r>
+              <w:rPr>
+                <w:noProof/>
+                <w:webHidden/>
+              </w:rPr>
+              <w:t>4</w:t>
+            </w:r>
+            <w:r>
+              <w:rPr>
+                <w:noProof/>
+                <w:webHidden/>
+              </w:rPr>
+              <w:fldChar w:fldCharType="end"/>
+            </w:r>
+          </w:hyperlink>
+        </w:p>
+        <w:p>
+          <w:pPr>
+            <w:pStyle w:val="TM1"/>
+            <w:tabs>
+              <w:tab w:val="right" w:leader="dot" w:pos="9062"/>
+            </w:tabs>
+            <w:rPr>
+              <w:rFonts w:eastAsiaTheme="minorEastAsia"/>
+              <w:noProof/>
+              <w:lang w:eastAsia="fr-CH"/>
+            </w:rPr>
+          </w:pPr>
+          <w:hyperlink w:anchor="_Toc224285651" w:history="1">
+            <w:r>
+              <w:rPr>
+                <w:rStyle w:val="Lienhypertexte"/>
+                <w:noProof/>
+              </w:rPr>
+              <w:t>V3-POO</w:t>
+            </w:r>
+            <w:r>
+              <w:rPr>
+                <w:noProof/>
+                <w:webHidden/>
+              </w:rPr>
+              <w:tab/>
+            </w:r>
+            <w:r>
+              <w:rPr>
+                <w:noProof/>
+                <w:webHidden/>
+              </w:rPr>
+              <w:fldChar w:fldCharType="begin"/>
+            </w:r>
+            <w:r>
+              <w:rPr>
+                <w:noProof/>
+                <w:webHidden/>
+              </w:rPr>
+              <w:instrText xml:space="preserve"> PAGEREF _Toc224285651 \h </w:instrText>
+            </w:r>
+            <w:r>
+              <w:rPr>
+                <w:noProof/>
+                <w:webHidden/>
+              </w:rPr>
+            </w:r>
+            <w:r>
+              <w:rPr>
+                <w:noProof/>
+                <w:webHidden/>
+              </w:rPr>
+              <w:fldChar w:fldCharType="separate"/>
+            </w:r>
+            <w:r>
+              <w:rPr>
+                <w:noProof/>
+                <w:webHidden/>
+              </w:rPr>
+              <w:t>5</w:t>
+            </w:r>
+            <w:r>
+              <w:rPr>
+                <w:noProof/>
+                <w:webHidden/>
+              </w:rPr>
+              <w:fldChar w:fldCharType="end"/>
+            </w:r>
+          </w:hyperlink>
+        </w:p>
+        <w:p>
+          <w:pPr>
+            <w:pStyle w:val="TM2"/>
+            <w:tabs>
+              <w:tab w:val="right" w:leader="dot" w:pos="9062"/>
+            </w:tabs>
+            <w:rPr>
+              <w:rFonts w:eastAsiaTheme="minorEastAsia"/>
+              <w:noProof/>
+              <w:lang w:eastAsia="fr-CH"/>
+            </w:rPr>
+          </w:pPr>
+          <w:hyperlink w:anchor="_Toc224285652" w:history="1">
+            <w:r>
+              <w:rPr>
+                <w:rStyle w:val="Lienhypertexte"/>
+                <w:noProof/>
+              </w:rPr>
+              <w:t>Description</w:t>
+            </w:r>
+            <w:r>
+              <w:rPr>
+                <w:noProof/>
+                <w:webHidden/>
+              </w:rPr>
+              <w:tab/>
+            </w:r>
+            <w:r>
+              <w:rPr>
+                <w:noProof/>
+                <w:webHidden/>
+              </w:rPr>
+              <w:fldChar w:fldCharType="begin"/>
+            </w:r>
+            <w:r>
+              <w:rPr>
+                <w:noProof/>
+                <w:webHidden/>
+              </w:rPr>
+              <w:instrText xml:space="preserve"> PAGEREF _Toc224285652 \h </w:instrText>
+            </w:r>
+            <w:r>
+              <w:rPr>
+                <w:noProof/>
+                <w:webHidden/>
+              </w:rPr>
+            </w:r>
+            <w:r>
+              <w:rPr>
+                <w:noProof/>
+                <w:webHidden/>
+              </w:rPr>
+              <w:fldChar w:fldCharType="separate"/>
+            </w:r>
+            <w:r>
+              <w:rPr>
+                <w:noProof/>
+                <w:webHidden/>
+              </w:rPr>
+              <w:t>5</w:t>
+            </w:r>
+            <w:r>
+              <w:rPr>
+                <w:noProof/>
+                <w:webHidden/>
+              </w:rPr>
+              <w:fldChar w:fldCharType="end"/>
+            </w:r>
+          </w:hyperlink>
+        </w:p>
+        <w:p>
+          <w:pPr>
+            <w:pStyle w:val="TM1"/>
+            <w:tabs>
+              <w:tab w:val="right" w:leader="dot" w:pos="9062"/>
+            </w:tabs>
+            <w:rPr>
+              <w:rFonts w:eastAsiaTheme="minorEastAsia"/>
+              <w:noProof/>
+              <w:lang w:eastAsia="fr-CH"/>
+            </w:rPr>
+          </w:pPr>
+          <w:hyperlink w:anchor="_Toc224285653" w:history="1">
+            <w:r>
+              <w:rPr>
+                <w:rStyle w:val="Lienhypertexte"/>
+                <w:noProof/>
+              </w:rPr>
+              <w:t>V1 =&gt; V2</w:t>
+            </w:r>
+            <w:r>
+              <w:rPr>
+                <w:noProof/>
+                <w:webHidden/>
+              </w:rPr>
+              <w:tab/>
+            </w:r>
+            <w:r>
+              <w:rPr>
+                <w:noProof/>
+                <w:webHidden/>
+              </w:rPr>
+              <w:fldChar w:fldCharType="begin"/>
+            </w:r>
+            <w:r>
+              <w:rPr>
+                <w:noProof/>
+                <w:webHidden/>
+              </w:rPr>
+              <w:instrText xml:space="preserve"> PAGEREF _Toc224285653 \h </w:instrText>
+            </w:r>
+            <w:r>
+              <w:rPr>
+                <w:noProof/>
+                <w:webHidden/>
+              </w:rPr>
+            </w:r>
+            <w:r>
+              <w:rPr>
+                <w:noProof/>
+                <w:webHidden/>
+              </w:rPr>
+              <w:fldChar w:fldCharType="separate"/>
+            </w:r>
+            <w:r>
+              <w:rPr>
+                <w:noProof/>
+                <w:webHidden/>
+              </w:rPr>
+              <w:t>6</w:t>
+            </w:r>
+            <w:r>
+              <w:rPr>
+                <w:noProof/>
+                <w:webHidden/>
+              </w:rPr>
+              <w:fldChar w:fldCharType="end"/>
+            </w:r>
+          </w:hyperlink>
+        </w:p>
+        <w:p>
+          <w:pPr>
+            <w:pStyle w:val="TM2"/>
+            <w:tabs>
+              <w:tab w:val="right" w:leader="dot" w:pos="9062"/>
+            </w:tabs>
+            <w:rPr>
+              <w:rFonts w:eastAsiaTheme="minorEastAsia"/>
+              <w:noProof/>
+              <w:lang w:eastAsia="fr-CH"/>
+            </w:rPr>
+          </w:pPr>
+          <w:hyperlink w:anchor="_Toc224285654" w:history="1">
+            <w:r>
+              <w:rPr>
+                <w:rStyle w:val="Lienhypertexte"/>
+                <w:noProof/>
+              </w:rPr>
+              <w:t>Différences</w:t>
+            </w:r>
+            <w:r>
+              <w:rPr>
+                <w:noProof/>
+                <w:webHidden/>
+              </w:rPr>
+              <w:tab/>
+            </w:r>
+            <w:r>
+              <w:rPr>
+                <w:noProof/>
+                <w:webHidden/>
+              </w:rPr>
+              <w:fldChar w:fldCharType="begin"/>
+            </w:r>
+            <w:r>
+              <w:rPr>
+                <w:noProof/>
+                <w:webHidden/>
+              </w:rPr>
+              <w:instrText xml:space="preserve"> PAGEREF _Toc224285654 \h </w:instrText>
+            </w:r>
+            <w:r>
+              <w:rPr>
+                <w:noProof/>
+                <w:webHidden/>
+              </w:rPr>
+            </w:r>
+            <w:r>
+              <w:rPr>
+                <w:noProof/>
+                <w:webHidden/>
+              </w:rPr>
+              <w:fldChar w:fldCharType="separate"/>
+            </w:r>
+            <w:r>
+              <w:rPr>
+                <w:noProof/>
+                <w:webHidden/>
+              </w:rPr>
+              <w:t>6</w:t>
+            </w:r>
+            <w:r>
+              <w:rPr>
+                <w:noProof/>
+                <w:webHidden/>
+              </w:rPr>
+              <w:fldChar w:fldCharType="end"/>
+            </w:r>
+          </w:hyperlink>
+        </w:p>
+        <w:p>
+          <w:pPr>
+            <w:pStyle w:val="TM2"/>
+            <w:tabs>
+              <w:tab w:val="right" w:leader="dot" w:pos="9062"/>
+            </w:tabs>
+            <w:rPr>
+              <w:rFonts w:eastAsiaTheme="minorEastAsia"/>
+              <w:noProof/>
+              <w:lang w:eastAsia="fr-CH"/>
+            </w:rPr>
+          </w:pPr>
+          <w:hyperlink w:anchor="_Toc224285655" w:history="1">
+            <w:r>
+              <w:rPr>
+                <w:rStyle w:val="Lienhypertexte"/>
+                <w:noProof/>
+              </w:rPr>
+              <w:t>Avantages</w:t>
+            </w:r>
+            <w:r>
+              <w:rPr>
+                <w:noProof/>
+                <w:webHidden/>
+              </w:rPr>
+              <w:tab/>
+            </w:r>
+            <w:r>
+              <w:rPr>
+                <w:noProof/>
+                <w:webHidden/>
+              </w:rPr>
+              <w:fldChar w:fldCharType="begin"/>
+            </w:r>
+            <w:r>
+              <w:rPr>
+                <w:noProof/>
+                <w:webHidden/>
+              </w:rPr>
+              <w:instrText xml:space="preserve"> PAGEREF _Toc224285655 \h </w:instrText>
+            </w:r>
+            <w:r>
+              <w:rPr>
+                <w:noProof/>
+                <w:webHidden/>
+              </w:rPr>
+            </w:r>
+            <w:r>
+              <w:rPr>
+                <w:noProof/>
+                <w:webHidden/>
+              </w:rPr>
+              <w:fldChar w:fldCharType="separate"/>
+            </w:r>
+            <w:r>
+              <w:rPr>
+                <w:noProof/>
+                <w:webHidden/>
+              </w:rPr>
+              <w:t>6</w:t>
+            </w:r>
+            <w:r>
+              <w:rPr>
+                <w:noProof/>
+                <w:webHidden/>
+              </w:rPr>
+              <w:fldChar w:fldCharType="end"/>
+            </w:r>
+          </w:hyperlink>
+        </w:p>
+        <w:p>
+          <w:pPr>
+            <w:pStyle w:val="TM2"/>
+            <w:tabs>
+              <w:tab w:val="right" w:leader="dot" w:pos="9062"/>
+            </w:tabs>
+            <w:rPr>
+              <w:rFonts w:eastAsiaTheme="minorEastAsia"/>
+              <w:noProof/>
+              <w:lang w:eastAsia="fr-CH"/>
+            </w:rPr>
+          </w:pPr>
+          <w:hyperlink w:anchor="_Toc224285656" w:history="1">
+            <w:r>
+              <w:rPr>
+                <w:rStyle w:val="Lienhypertexte"/>
+                <w:noProof/>
+              </w:rPr>
+              <w:t>Inconvénients :</w:t>
+            </w:r>
+            <w:r>
+              <w:rPr>
+                <w:noProof/>
+                <w:webHidden/>
+              </w:rPr>
+              <w:tab/>
+            </w:r>
+            <w:r>
+              <w:rPr>
+                <w:noProof/>
+                <w:webHidden/>
+              </w:rPr>
+              <w:fldChar w:fldCharType="begin"/>
+            </w:r>
+            <w:r>
+              <w:rPr>
+                <w:noProof/>
+                <w:webHidden/>
+              </w:rPr>
+              <w:instrText xml:space="preserve"> PAGEREF _Toc224285656 \h </w:instrText>
+            </w:r>
+            <w:r>
+              <w:rPr>
+                <w:noProof/>
+                <w:webHidden/>
+              </w:rPr>
+            </w:r>
+            <w:r>
+              <w:rPr>
+                <w:noProof/>
+                <w:webHidden/>
+              </w:rPr>
+              <w:fldChar w:fldCharType="separate"/>
+            </w:r>
+            <w:r>
+              <w:rPr>
+                <w:noProof/>
+                <w:webHidden/>
+              </w:rPr>
+              <w:t>6</w:t>
+            </w:r>
+            <w:r>
+              <w:rPr>
+                <w:noProof/>
+                <w:webHidden/>
+              </w:rPr>
+              <w:fldChar w:fldCharType="end"/>
+            </w:r>
+          </w:hyperlink>
+        </w:p>
+        <w:p>
+          <w:pPr>
+            <w:pStyle w:val="TM1"/>
+            <w:tabs>
+              <w:tab w:val="right" w:leader="dot" w:pos="9062"/>
+            </w:tabs>
+            <w:rPr>
+              <w:rFonts w:eastAsiaTheme="minorEastAsia"/>
+              <w:noProof/>
+              <w:lang w:eastAsia="fr-CH"/>
+            </w:rPr>
+          </w:pPr>
+          <w:hyperlink w:anchor="_Toc224285657" w:history="1">
+            <w:r>
+              <w:rPr>
+                <w:rStyle w:val="Lienhypertexte"/>
+                <w:noProof/>
+              </w:rPr>
+              <w:t>V2 =&gt; V3</w:t>
+            </w:r>
+            <w:r>
+              <w:rPr>
+                <w:noProof/>
+                <w:webHidden/>
+              </w:rPr>
+              <w:tab/>
+            </w:r>
+            <w:r>
+              <w:rPr>
+                <w:noProof/>
+                <w:webHidden/>
+              </w:rPr>
+              <w:fldChar w:fldCharType="begin"/>
+            </w:r>
+            <w:r>
+              <w:rPr>
+                <w:noProof/>
+                <w:webHidden/>
+              </w:rPr>
+              <w:instrText xml:space="preserve"> PAGEREF _Toc224285657 \h </w:instrText>
+            </w:r>
+            <w:r>
+              <w:rPr>
+                <w:noProof/>
+                <w:webHidden/>
+              </w:rPr>
+            </w:r>
+            <w:r>
+              <w:rPr>
+                <w:noProof/>
+                <w:webHidden/>
+              </w:rPr>
+              <w:fldChar w:fldCharType="separate"/>
+            </w:r>
+            <w:r>
+              <w:rPr>
+                <w:noProof/>
+                <w:webHidden/>
+              </w:rPr>
+              <w:t>7</w:t>
+            </w:r>
+            <w:r>
+              <w:rPr>
+                <w:noProof/>
+                <w:webHidden/>
+              </w:rPr>
+              <w:fldChar w:fldCharType="end"/>
+            </w:r>
+          </w:hyperlink>
+        </w:p>
+        <w:p>
+          <w:pPr>
+            <w:pStyle w:val="TM2"/>
+            <w:tabs>
+              <w:tab w:val="right" w:leader="dot" w:pos="9062"/>
+            </w:tabs>
+            <w:rPr>
+              <w:rFonts w:eastAsiaTheme="minorEastAsia"/>
+              <w:noProof/>
+              <w:lang w:eastAsia="fr-CH"/>
+            </w:rPr>
+          </w:pPr>
+          <w:hyperlink w:anchor="_Toc224285658" w:history="1">
+            <w:r>
+              <w:rPr>
+                <w:rStyle w:val="Lienhypertexte"/>
+                <w:noProof/>
+              </w:rPr>
+              <w:t>Différences</w:t>
+            </w:r>
+            <w:r>
+              <w:rPr>
+                <w:noProof/>
+                <w:webHidden/>
+              </w:rPr>
+              <w:tab/>
+            </w:r>
+            <w:r>
+              <w:rPr>
+                <w:noProof/>
+                <w:webHidden/>
+              </w:rPr>
+              <w:fldChar w:fldCharType="begin"/>
+            </w:r>
+            <w:r>
+              <w:rPr>
+                <w:noProof/>
+                <w:webHidden/>
+              </w:rPr>
+              <w:instrText xml:space="preserve"> PAGEREF _Toc224285658 \h </w:instrText>
+            </w:r>
+            <w:r>
+              <w:rPr>
+                <w:noProof/>
+                <w:webHidden/>
+              </w:rPr>
+            </w:r>
+            <w:r>
+              <w:rPr>
+                <w:noProof/>
+                <w:webHidden/>
+              </w:rPr>
+              <w:fldChar w:fldCharType="separate"/>
+            </w:r>
+            <w:r>
+              <w:rPr>
+                <w:noProof/>
+                <w:webHidden/>
+              </w:rPr>
+              <w:t>7</w:t>
+            </w:r>
+            <w:r>
+              <w:rPr>
+                <w:noProof/>
+                <w:webHidden/>
+              </w:rPr>
+              <w:fldChar w:fldCharType="end"/>
+            </w:r>
+          </w:hyperlink>
+        </w:p>
+        <w:p>
+          <w:pPr>
+            <w:pStyle w:val="TM2"/>
+            <w:tabs>
+              <w:tab w:val="right" w:leader="dot" w:pos="9062"/>
+            </w:tabs>
+            <w:rPr>
+              <w:rFonts w:eastAsiaTheme="minorEastAsia"/>
+              <w:noProof/>
+              <w:lang w:eastAsia="fr-CH"/>
+            </w:rPr>
+          </w:pPr>
+          <w:hyperlink w:anchor="_Toc224285659" w:history="1">
+            <w:r>
+              <w:rPr>
+                <w:rStyle w:val="Lienhypertexte"/>
+                <w:noProof/>
+              </w:rPr>
+              <w:t>Avantages :</w:t>
+            </w:r>
+            <w:r>
+              <w:rPr>
+                <w:noProof/>
+                <w:webHidden/>
+              </w:rPr>
+              <w:tab/>
+            </w:r>
+            <w:r>
+              <w:rPr>
+                <w:noProof/>
+                <w:webHidden/>
+              </w:rPr>
+              <w:fldChar w:fldCharType="begin"/>
+            </w:r>
+            <w:r>
+              <w:rPr>
+                <w:noProof/>
+                <w:webHidden/>
+              </w:rPr>
+              <w:instrText xml:space="preserve"> PAGEREF _Toc224285659 \h </w:instrText>
+            </w:r>
+            <w:r>
+              <w:rPr>
+                <w:noProof/>
+                <w:webHidden/>
+              </w:rPr>
+            </w:r>
+            <w:r>
+              <w:rPr>
+                <w:noProof/>
+                <w:webHidden/>
+              </w:rPr>
+              <w:fldChar w:fldCharType="separate"/>
+            </w:r>
+            <w:r>
+              <w:rPr>
+                <w:noProof/>
+                <w:webHidden/>
+              </w:rPr>
+              <w:t>7</w:t>
+            </w:r>
+            <w:r>
+              <w:rPr>
+                <w:noProof/>
+                <w:webHidden/>
+              </w:rPr>
+              <w:fldChar w:fldCharType="end"/>
+            </w:r>
+          </w:hyperlink>
+        </w:p>
+        <w:p>
+          <w:pPr>
+            <w:pStyle w:val="TM2"/>
+            <w:tabs>
+              <w:tab w:val="right" w:leader="dot" w:pos="9062"/>
+            </w:tabs>
+            <w:rPr>
+              <w:rFonts w:eastAsiaTheme="minorEastAsia"/>
+              <w:noProof/>
+              <w:lang w:eastAsia="fr-CH"/>
+            </w:rPr>
+          </w:pPr>
+          <w:hyperlink w:anchor="_Toc224285660" w:history="1">
+            <w:r>
+              <w:rPr>
+                <w:rStyle w:val="Lienhypertexte"/>
+                <w:noProof/>
+              </w:rPr>
+              <w:t>Inconvénients :</w:t>
+            </w:r>
+            <w:r>
+              <w:rPr>
+                <w:noProof/>
+                <w:webHidden/>
+              </w:rPr>
+              <w:tab/>
+            </w:r>
+            <w:r>
+              <w:rPr>
+                <w:noProof/>
+                <w:webHidden/>
+              </w:rPr>
+              <w:fldChar w:fldCharType="begin"/>
+            </w:r>
+            <w:r>
+              <w:rPr>
+                <w:noProof/>
+                <w:webHidden/>
+              </w:rPr>
+              <w:instrText xml:space="preserve"> PAGEREF _Toc224285660 \h </w:instrText>
+            </w:r>
+            <w:r>
+              <w:rPr>
+                <w:noProof/>
+                <w:webHidden/>
+              </w:rPr>
+            </w:r>
+            <w:r>
+              <w:rPr>
+                <w:noProof/>
+                <w:webHidden/>
+              </w:rPr>
+              <w:fldChar w:fldCharType="separate"/>
+            </w:r>
+            <w:r>
+              <w:rPr>
+                <w:noProof/>
+                <w:webHidden/>
+              </w:rPr>
+              <w:t>7</w:t>
+            </w:r>
+            <w:r>
+              <w:rPr>
+                <w:noProof/>
+                <w:webHidden/>
+              </w:rPr>
+              <w:fldChar w:fldCharType="end"/>
+            </w:r>
+          </w:hyperlink>
+        </w:p>
+        <w:p>
+          <w:pPr>
+            <w:pStyle w:val="TM1"/>
+            <w:tabs>
+              <w:tab w:val="right" w:leader="dot" w:pos="9062"/>
+            </w:tabs>
+            <w:rPr>
+              <w:rFonts w:eastAsiaTheme="minorEastAsia"/>
+              <w:noProof/>
+              <w:lang w:eastAsia="fr-CH"/>
+            </w:rPr>
+          </w:pPr>
+          <w:hyperlink w:anchor="_Toc224285661" w:history="1">
+            <w:r>
+              <w:rPr>
+                <w:rStyle w:val="Lienhypertexte"/>
+                <w:noProof/>
+              </w:rPr>
+              <w:t>Conclusion</w:t>
+            </w:r>
+            <w:r>
+              <w:rPr>
+                <w:noProof/>
+                <w:webHidden/>
+              </w:rPr>
+              <w:tab/>
+            </w:r>
+            <w:r>
+              <w:rPr>
+                <w:noProof/>
+                <w:webHidden/>
+              </w:rPr>
+              <w:fldChar w:fldCharType="begin"/>
+            </w:r>
+            <w:r>
+              <w:rPr>
+                <w:noProof/>
+                <w:webHidden/>
+              </w:rPr>
+              <w:instrText xml:space="preserve"> PAGEREF _Toc224285661 \h </w:instrText>
+            </w:r>
+            <w:r>
+              <w:rPr>
+                <w:noProof/>
+                <w:webHidden/>
+              </w:rPr>
+            </w:r>
+            <w:r>
+              <w:rPr>
+                <w:noProof/>
+                <w:webHidden/>
+              </w:rPr>
+              <w:fldChar w:fldCharType="separate"/>
+            </w:r>
+            <w:r>
+              <w:rPr>
+                <w:noProof/>
+                <w:webHidden/>
+              </w:rPr>
+              <w:t>8</w:t>
+            </w:r>
+            <w:r>
+              <w:rPr>
+                <w:noProof/>
+                <w:webHidden/>
+              </w:rPr>
+              <w:fldChar w:fldCharType="end"/>
+            </w:r>
+          </w:hyperlink>
+        </w:p>
+        <w:p>
+          <w:pPr>
+            <w:sectPr>
+              <w:footerReference w:type="default" r:id="rId11"/>
+              <w:pgSz w:w="11906" w:h="16838"/>
+              <w:pgMar w:top="1417" w:right="1417" w:bottom="1417" w:left="1417" w:header="708" w:footer="708" w:gutter="0"/>
+              <w:pgNumType w:start="0"/>
+              <w:cols w:space="708"/>
+              <w:titlePg/>
+              <w:docGrid w:linePitch="360"/>
+            </w:sectPr>
+          </w:pPr>
           <w:r>
             <w:rPr>
               <w:b/>
@@ -731,6 +1816,80 @@
     </w:sdt>
     <w:p>
       <w:pPr>
+        <w:pStyle w:val="Titre1"/>
+      </w:pPr>
+      <w:bookmarkStart w:id="0" w:name="_Toc224285644"/>
+      <w:r>
+        <w:lastRenderedPageBreak/>
+        <w:t>Introduction</w:t>
+      </w:r>
+      <w:bookmarkEnd w:id="0"/>
+    </w:p>
+    <w:p>
+      <w:pPr>
+        <w:pStyle w:val="Titre2"/>
+      </w:pPr>
+      <w:bookmarkStart w:id="1" w:name="_Toc224285645"/>
+      <w:r>
+        <w:t>Objectifs pédagogiques</w:t>
+      </w:r>
+      <w:bookmarkEnd w:id="1"/>
+    </w:p>
+    <w:p>
+      <w:pPr>
+        <w:pStyle w:val="Standard"/>
+      </w:pPr>
+      <w:r>
+        <w:t xml:space="preserve">Dans le cadre du Projet 320, je vais réaliser un programme de simulation d’un bancomat. Au travers de ce projet </w:t>
+      </w:r>
+      <w:r>
+        <w:t>nous allons</w:t>
+      </w:r>
+      <w:r>
+        <w:t xml:space="preserve"> découvrir le system de branchement </w:t>
+      </w:r>
+      <w:r>
+        <w:t xml:space="preserve">et en général le fonctionnement des repository </w:t>
+      </w:r>
+      <w:r>
+        <w:t xml:space="preserve">dans </w:t>
+      </w:r>
+      <w:r>
+        <w:t>GitHub</w:t>
+      </w:r>
+      <w:r>
+        <w:t>.</w:t>
+      </w:r>
+    </w:p>
+    <w:p>
+      <w:pPr>
+        <w:pStyle w:val="Titre2"/>
+      </w:pPr>
+      <w:bookmarkStart w:id="2" w:name="_Toc224285646"/>
+      <w:r>
+        <w:t>Choix</w:t>
+      </w:r>
+      <w:bookmarkEnd w:id="2"/>
+    </w:p>
+    <w:p>
+      <w:pPr>
+        <w:pStyle w:val="Standard"/>
+      </w:pPr>
+      <w:r>
+        <w:t>Mon choix s’est porté sur comme je l’ai mentionné précédemment une simulation de bancomat.</w:t>
+      </w:r>
+      <w:r>
+        <w:t xml:space="preserve"> Car je me suis dit que cela pouvait être un programme dans lequel je pourrais essayer de faire un bon visuel dans le menu et dans </w:t>
+      </w:r>
+      <w:r>
+        <w:t>les prochaines sections</w:t>
+      </w:r>
+      <w:r>
+        <w:t>.</w:t>
+      </w:r>
+    </w:p>
+    <w:p>
+      <w:pPr>
         <w:rPr>
           <w:rFonts w:asciiTheme="majorHAnsi" w:eastAsiaTheme="majorEastAsia" w:hAnsiTheme="majorHAnsi" w:cstheme="majorBidi"/>
           <w:color w:val="0F4761" w:themeColor="accent1" w:themeShade="BF"/>
@@ -746,80 +1905,1065 @@
       <w:pPr>
         <w:pStyle w:val="Titre1"/>
       </w:pPr>
-      <w:bookmarkStart w:id="0" w:name="_Toc219296472"/>
+      <w:bookmarkStart w:id="3" w:name="_Toc224285647"/>
       <w:r>
         <w:lastRenderedPageBreak/>
-        <w:t>Introduction</w:t>
-      </w:r>
-      <w:bookmarkEnd w:id="0"/>
+        <w:t>V1-Procédural</w:t>
+      </w:r>
+      <w:bookmarkEnd w:id="3"/>
     </w:p>
     <w:p>
       <w:pPr>
         <w:pStyle w:val="Titre2"/>
       </w:pPr>
-      <w:r>
-        <w:t>Objectifs pédagogiques</w:t>
+      <w:bookmarkStart w:id="4" w:name="_Toc224285648"/>
+      <w:r>
+        <w:t>Description</w:t>
+      </w:r>
+      <w:bookmarkEnd w:id="4"/>
+    </w:p>
+    <w:p>
+      <w:r>
+        <w:t xml:space="preserve">Le programme simule un bancomat en console C#. Il s'articule autour d'une classe unique Program et d'un </w:t>
+      </w:r>
+      <w:proofErr w:type="spellStart"/>
+      <w:r>
+        <w:t>struct</w:t>
+      </w:r>
+      <w:proofErr w:type="spellEnd"/>
+      <w:r>
+        <w:t xml:space="preserve"> </w:t>
+      </w:r>
+      <w:proofErr w:type="spellStart"/>
+      <w:r>
+        <w:t>PasswordData</w:t>
+      </w:r>
+      <w:proofErr w:type="spellEnd"/>
+      <w:r>
+        <w:t xml:space="preserve"> stockant les données d'authentification.</w:t>
+      </w:r>
+    </w:p>
+    <w:p>
+      <w:r>
+        <w:t>Le flux principal suit trois étapes : affichage d'un écran de bienvenue, vérification du code PIN via un pavé numérique interactif, puis accès au menu bancaire proposant retrait, consultation du solde ou quitter.</w:t>
+      </w:r>
+    </w:p>
+    <w:p>
+      <w:r>
+        <w:t xml:space="preserve">L'affichage est entièrement géré en console avec des caractères Unicode, via des méthodes utilitaires de dessin. Les erreurs sont signalées par des </w:t>
+      </w:r>
+      <w:r>
+        <w:t>pop-ups</w:t>
+      </w:r>
+      <w:r>
+        <w:t xml:space="preserve"> Windows grâce à user32.dll.</w:t>
+      </w:r>
+    </w:p>
+    <w:p>
+      <w:r>
+        <w:t>L'architecture est sans séparation entre logique métier et affichage.</w:t>
       </w:r>
     </w:p>
     <w:p>
       <w:pPr>
-        <w:pStyle w:val="Standard"/>
+        <w:rPr>
+          <w:rFonts w:asciiTheme="majorHAnsi" w:eastAsiaTheme="majorEastAsia" w:hAnsiTheme="majorHAnsi" w:cstheme="majorBidi"/>
+          <w:color w:val="0F4761" w:themeColor="accent1" w:themeShade="BF"/>
+          <w:sz w:val="40"/>
+          <w:szCs w:val="40"/>
+        </w:rPr>
       </w:pPr>
       <w:r>
-        <w:t xml:space="preserve">Dans le cadre du Projet 320, je vais réaliser un programme de simulation d’un bancomat. Au travers de ce projet </w:t>
-      </w:r>
-      <w:r>
-        <w:t>nous allons</w:t>
-      </w:r>
-      <w:r>
-        <w:t xml:space="preserve"> découvrir le system de branchement </w:t>
-      </w:r>
-      <w:r>
-        <w:t xml:space="preserve">et en général le fonctionnement des repository </w:t>
-      </w:r>
-      <w:r>
-        <w:t xml:space="preserve">dans </w:t>
-      </w:r>
-      <w:proofErr w:type="spellStart"/>
-      <w:r>
-        <w:t>Github</w:t>
-      </w:r>
-      <w:proofErr w:type="spellEnd"/>
-      <w:r>
-        <w:t>.</w:t>
-      </w:r>
+        <w:br w:type="page"/>
+      </w:r>
+    </w:p>
+    <w:p>
+      <w:pPr>
+        <w:pStyle w:val="Titre1"/>
+      </w:pPr>
+      <w:bookmarkStart w:id="5" w:name="_Toc224285649"/>
+      <w:r>
+        <w:lastRenderedPageBreak/>
+        <w:t>V2-Modulaire</w:t>
+      </w:r>
+      <w:bookmarkEnd w:id="5"/>
     </w:p>
     <w:p>
       <w:pPr>
         <w:pStyle w:val="Titre2"/>
       </w:pPr>
-      <w:bookmarkStart w:id="1" w:name="_Toc219296473"/>
-      <w:r>
-        <w:t>Choix</w:t>
-      </w:r>
-      <w:bookmarkEnd w:id="1"/>
+      <w:bookmarkStart w:id="6" w:name="_Toc224285650"/>
+      <w:r>
+        <w:t>Description</w:t>
+      </w:r>
+      <w:bookmarkEnd w:id="6"/>
+    </w:p>
+    <w:p>
+      <w:r>
+        <w:t xml:space="preserve">Le programme a été refactorisé en plusieurs fichiers répartis dans deux </w:t>
+      </w:r>
+      <w:proofErr w:type="spellStart"/>
+      <w:r>
+        <w:t>namespaces</w:t>
+      </w:r>
+      <w:proofErr w:type="spellEnd"/>
+      <w:r>
+        <w:t xml:space="preserve"> distincts.</w:t>
+      </w:r>
+    </w:p>
+    <w:p>
+      <w:r>
+        <w:rPr>
+          <w:b/>
+          <w:bCs/>
+        </w:rPr>
+        <w:t>Display</w:t>
+      </w:r>
+      <w:r>
+        <w:t xml:space="preserve"> regroupe l'affichage : </w:t>
+      </w:r>
+      <w:proofErr w:type="spellStart"/>
+      <w:r>
+        <w:t>SuperConsole</w:t>
+      </w:r>
+      <w:proofErr w:type="spellEnd"/>
+      <w:r>
+        <w:t xml:space="preserve"> centralise tous les utilitaires de dessin console, et Menu gère la navigation principale.</w:t>
+      </w:r>
+    </w:p>
+    <w:p>
+      <w:proofErr w:type="spellStart"/>
+      <w:r>
+        <w:rPr>
+          <w:b/>
+          <w:bCs/>
+        </w:rPr>
+        <w:t>Features</w:t>
+      </w:r>
+      <w:proofErr w:type="spellEnd"/>
+      <w:r>
+        <w:t xml:space="preserve"> contient la logique métier : </w:t>
+      </w:r>
+      <w:proofErr w:type="spellStart"/>
+      <w:r>
+        <w:t>Verifications</w:t>
+      </w:r>
+      <w:proofErr w:type="spellEnd"/>
+      <w:r>
+        <w:t xml:space="preserve"> gère l'authentification PIN, Transactions traite les dépôts et retraits, </w:t>
+      </w:r>
+      <w:proofErr w:type="spellStart"/>
+      <w:r>
+        <w:t>AccountAmount</w:t>
+      </w:r>
+      <w:proofErr w:type="spellEnd"/>
+      <w:r>
+        <w:t xml:space="preserve"> affiche le solde, et </w:t>
+      </w:r>
+      <w:proofErr w:type="spellStart"/>
+      <w:r>
+        <w:t>Receipt</w:t>
+      </w:r>
+      <w:proofErr w:type="spellEnd"/>
+      <w:r>
+        <w:t xml:space="preserve"> imprime le reçu.</w:t>
+      </w:r>
+    </w:p>
+    <w:p>
+      <w:r>
+        <w:rPr>
+          <w:b/>
+          <w:bCs/>
+        </w:rPr>
+        <w:t>Program</w:t>
+      </w:r>
+      <w:r>
+        <w:t xml:space="preserve"> reste le point d'entrée minimal, qui orchestre simplement l'appel aux différents modules.</w:t>
+      </w:r>
+    </w:p>
+    <w:p>
+      <w:r>
+        <w:t xml:space="preserve">Par rapport à la version précédente, l'architecture est désormais </w:t>
+      </w:r>
+      <w:r>
+        <w:rPr>
+          <w:b/>
+          <w:bCs/>
+        </w:rPr>
+        <w:t>orientée responsabilités</w:t>
+      </w:r>
+      <w:r>
+        <w:t xml:space="preserve"> : chaque classe </w:t>
+      </w:r>
+      <w:proofErr w:type="gramStart"/>
+      <w:r>
+        <w:t>a</w:t>
+      </w:r>
+      <w:proofErr w:type="gramEnd"/>
+      <w:r>
+        <w:t xml:space="preserve"> un rôle précis, ce qui améliore la lisibilité et la maintenabilité du code.</w:t>
+      </w:r>
     </w:p>
     <w:p>
       <w:pPr>
-        <w:pStyle w:val="Standard"/>
+        <w:rPr>
+          <w:rFonts w:asciiTheme="majorHAnsi" w:eastAsiaTheme="majorEastAsia" w:hAnsiTheme="majorHAnsi" w:cstheme="majorBidi"/>
+          <w:color w:val="0F4761" w:themeColor="accent1" w:themeShade="BF"/>
+          <w:sz w:val="40"/>
+          <w:szCs w:val="40"/>
+        </w:rPr>
       </w:pPr>
       <w:r>
-        <w:t>Mon choix s’est porté sur comme je l’ai mentionné précédemment une simulation de bancomat.</w:t>
-      </w:r>
-      <w:r>
-        <w:t xml:space="preserve"> Car je me suis dit que cela pouvait être un programme dans lequel je pourrais essayer de faire un bon visuel dans le menu et dans les prochaines section.</w:t>
+        <w:br w:type="page"/>
+      </w:r>
+    </w:p>
+    <w:p>
+      <w:pPr>
+        <w:pStyle w:val="Titre1"/>
+      </w:pPr>
+      <w:bookmarkStart w:id="7" w:name="_Toc224285651"/>
+      <w:r>
+        <w:lastRenderedPageBreak/>
+        <w:t>V3-POO</w:t>
+      </w:r>
+      <w:bookmarkEnd w:id="7"/>
+    </w:p>
+    <w:p>
+      <w:pPr>
+        <w:pStyle w:val="Titre2"/>
+      </w:pPr>
+      <w:bookmarkStart w:id="8" w:name="_Toc224285652"/>
+      <w:r>
+        <w:t>Description</w:t>
+      </w:r>
+      <w:bookmarkEnd w:id="8"/>
+    </w:p>
+    <w:p>
+      <w:r>
+        <w:t xml:space="preserve">Cette version introduit une architecture </w:t>
+      </w:r>
+      <w:r>
+        <w:rPr>
+          <w:b/>
+          <w:bCs/>
+        </w:rPr>
+        <w:t>orientée objet</w:t>
+      </w:r>
+      <w:r>
+        <w:t xml:space="preserve"> complète avec héritage et polymorphisme.</w:t>
+      </w:r>
+    </w:p>
+    <w:p>
+      <w:r>
+        <w:t xml:space="preserve">La classe </w:t>
+      </w:r>
+      <w:proofErr w:type="spellStart"/>
+      <w:r>
+        <w:t>Account</w:t>
+      </w:r>
+      <w:proofErr w:type="spellEnd"/>
+      <w:r>
+        <w:t xml:space="preserve"> est la base du modèle métier, étendue par Child, Teenager, </w:t>
+      </w:r>
+      <w:proofErr w:type="spellStart"/>
+      <w:r>
+        <w:t>Adult</w:t>
+      </w:r>
+      <w:proofErr w:type="spellEnd"/>
+      <w:r>
+        <w:t xml:space="preserve"> et Admin, chacune </w:t>
+      </w:r>
+      <w:r>
+        <w:t>modifiant</w:t>
+      </w:r>
+      <w:r>
+        <w:t xml:space="preserve"> </w:t>
+      </w:r>
+      <w:proofErr w:type="spellStart"/>
+      <w:r>
+        <w:t>Withdraw</w:t>
+      </w:r>
+      <w:proofErr w:type="spellEnd"/>
+      <w:r>
+        <w:t xml:space="preserve"> avec ses propres limites de retrait définies dans </w:t>
+      </w:r>
+      <w:proofErr w:type="spellStart"/>
+      <w:r>
+        <w:t>Factory</w:t>
+      </w:r>
+      <w:proofErr w:type="spellEnd"/>
+      <w:r>
+        <w:t>.</w:t>
+      </w:r>
+    </w:p>
+    <w:p>
+      <w:proofErr w:type="spellStart"/>
+      <w:r>
+        <w:t>Factory</w:t>
+      </w:r>
+      <w:proofErr w:type="spellEnd"/>
+      <w:r>
+        <w:t xml:space="preserve"> gère également la création de comptes via une interface de saisie guidée. Menu orchestre l'ouverture de session et la navigation. </w:t>
+      </w:r>
+      <w:proofErr w:type="spellStart"/>
+      <w:r>
+        <w:t>Verifications</w:t>
+      </w:r>
+      <w:proofErr w:type="spellEnd"/>
+      <w:r>
+        <w:t xml:space="preserve"> valide le PIN et les saisies. Transactions traite dépôts et retraits, </w:t>
+      </w:r>
+      <w:proofErr w:type="spellStart"/>
+      <w:r>
+        <w:t>Receipt</w:t>
+      </w:r>
+      <w:proofErr w:type="spellEnd"/>
+      <w:r>
+        <w:t xml:space="preserve"> affiche l'historique, et </w:t>
+      </w:r>
+      <w:proofErr w:type="spellStart"/>
+      <w:r>
+        <w:t>SuperConsole</w:t>
+      </w:r>
+      <w:proofErr w:type="spellEnd"/>
+      <w:r>
+        <w:t xml:space="preserve"> centralise tout le rendu visuel.</w:t>
+      </w:r>
+    </w:p>
+    <w:p>
+      <w:r>
+        <w:t>Program reste minimaliste, instanciant les objets principaux et coordonnant le flux global.</w:t>
+      </w:r>
+    </w:p>
+    <w:p>
+      <w:pPr>
+        <w:rPr>
+          <w:rFonts w:asciiTheme="majorHAnsi" w:eastAsiaTheme="majorEastAsia" w:hAnsiTheme="majorHAnsi" w:cstheme="majorBidi"/>
+          <w:color w:val="0F4761" w:themeColor="accent1" w:themeShade="BF"/>
+          <w:sz w:val="40"/>
+          <w:szCs w:val="40"/>
+        </w:rPr>
+      </w:pPr>
+      <w:r>
+        <w:br w:type="page"/>
+      </w:r>
+    </w:p>
+    <w:p>
+      <w:pPr>
+        <w:pStyle w:val="Titre1"/>
+      </w:pPr>
+      <w:bookmarkStart w:id="9" w:name="_Toc224285653"/>
+      <w:r>
+        <w:lastRenderedPageBreak/>
+        <w:t>V1 =&gt; V2</w:t>
+      </w:r>
+      <w:bookmarkEnd w:id="9"/>
+    </w:p>
+    <w:p>
+      <w:pPr>
+        <w:pStyle w:val="Titre2"/>
+      </w:pPr>
+      <w:bookmarkStart w:id="10" w:name="_Toc224285654"/>
+      <w:r>
+        <w:t>Différences</w:t>
+      </w:r>
+      <w:bookmarkEnd w:id="10"/>
+    </w:p>
+    <w:p>
+      <w:r>
+        <w:rPr>
+          <w:b/>
+          <w:bCs/>
+        </w:rPr>
+        <w:t>Architecture</w:t>
+      </w:r>
+      <w:r>
+        <w:t xml:space="preserve"> La V1 est un fichier unique avec tout dans Program. La V2 découpe le code en 7 fichiers répartis dans deux </w:t>
+      </w:r>
+      <w:proofErr w:type="spellStart"/>
+      <w:r>
+        <w:t>namespaces</w:t>
+      </w:r>
+      <w:proofErr w:type="spellEnd"/>
+      <w:r>
+        <w:t xml:space="preserve"> (Display / </w:t>
+      </w:r>
+      <w:proofErr w:type="spellStart"/>
+      <w:r>
+        <w:t>Features</w:t>
+      </w:r>
+      <w:proofErr w:type="spellEnd"/>
+      <w:r>
+        <w:t>). La V2 est plus lisible et maintenable, mais plus complexe à naviguer.</w:t>
+      </w:r>
+    </w:p>
+    <w:p>
+      <w:r>
+        <w:rPr>
+          <w:b/>
+          <w:bCs/>
+        </w:rPr>
+        <w:t>Paradigme</w:t>
+      </w:r>
+      <w:r>
+        <w:t xml:space="preserve"> La V1 est purement procédurale avec des méthodes statiques. La V2 reste procédurale mais organise mieux les responsabilités, sans encore introduire l'orienté objet.</w:t>
+      </w:r>
+    </w:p>
+    <w:p>
+      <w:r>
+        <w:rPr>
+          <w:b/>
+          <w:bCs/>
+        </w:rPr>
+        <w:t>Affichage</w:t>
+      </w:r>
+      <w:r>
+        <w:t xml:space="preserve"> En V1, les méthodes de dessin sont dans Program. En V2, elles sont centralisées dans </w:t>
+      </w:r>
+      <w:proofErr w:type="spellStart"/>
+      <w:r>
+        <w:t>SuperConsole</w:t>
+      </w:r>
+      <w:proofErr w:type="spellEnd"/>
+      <w:r>
+        <w:t>, ce qui évite la duplication et facilite les modifications visuelles.</w:t>
+      </w:r>
+    </w:p>
+    <w:p>
+      <w:r>
+        <w:rPr>
+          <w:b/>
+          <w:bCs/>
+        </w:rPr>
+        <w:t>Transactions</w:t>
+      </w:r>
+      <w:r>
+        <w:t xml:space="preserve"> La V1 ne gérait que les retraits. La V2 ajoute les </w:t>
+      </w:r>
+      <w:r>
+        <w:rPr>
+          <w:b/>
+          <w:bCs/>
+        </w:rPr>
+        <w:t>dépôts</w:t>
+      </w:r>
+      <w:r>
+        <w:t xml:space="preserve"> via </w:t>
+      </w:r>
+      <w:proofErr w:type="spellStart"/>
+      <w:r>
+        <w:t>PutInMoneyAmount</w:t>
+      </w:r>
+      <w:proofErr w:type="spellEnd"/>
+      <w:r>
+        <w:t xml:space="preserve"> et unifie les deux opérations dans </w:t>
+      </w:r>
+      <w:proofErr w:type="spellStart"/>
+      <w:r>
+        <w:t>MoneyMovement</w:t>
+      </w:r>
+      <w:proofErr w:type="spellEnd"/>
+      <w:r>
+        <w:t xml:space="preserve"> grâce à un booléen directionnel.</w:t>
+      </w:r>
+    </w:p>
+    <w:p>
+      <w:r>
+        <w:rPr>
+          <w:b/>
+          <w:bCs/>
+        </w:rPr>
+        <w:t>Journalisation</w:t>
+      </w:r>
+      <w:r>
+        <w:t xml:space="preserve"> La V1 utilisait un tableau </w:t>
+      </w:r>
+      <w:proofErr w:type="spellStart"/>
+      <w:proofErr w:type="gramStart"/>
+      <w:r>
+        <w:t>decimal</w:t>
+      </w:r>
+      <w:proofErr w:type="spellEnd"/>
+      <w:r>
+        <w:t>[</w:t>
+      </w:r>
+      <w:proofErr w:type="gramEnd"/>
+      <w:r>
+        <w:t xml:space="preserve">]. La V2 passe à </w:t>
+      </w:r>
+      <w:proofErr w:type="gramStart"/>
+      <w:r>
+        <w:t>string[</w:t>
+      </w:r>
+      <w:proofErr w:type="gramEnd"/>
+      <w:r>
+        <w:t>] pour stocker des entrées formatées comme "+ 50 CHF" ou "- 20 CHF", plus lisibles dans le reçu.</w:t>
+      </w:r>
+    </w:p>
+    <w:p>
+      <w:bookmarkStart w:id="11" w:name="_Toc224285655"/>
+      <w:r>
+        <w:rPr>
+          <w:rStyle w:val="Titre2Car"/>
+        </w:rPr>
+        <w:t>Avantages</w:t>
+      </w:r>
+      <w:bookmarkEnd w:id="11"/>
+      <w:r>
+        <w:rPr>
+          <w:b/>
+          <w:bCs/>
+        </w:rPr>
+        <w:t xml:space="preserve"> </w:t>
+      </w:r>
+      <w:r>
+        <w:t>:</w:t>
+      </w:r>
+    </w:p>
+    <w:p>
+      <w:r>
+        <w:t>Meilleure</w:t>
+      </w:r>
+      <w:r>
+        <w:t xml:space="preserve"> séparation des responsabilités, plus extensible, dépôts ajoutés.</w:t>
+      </w:r>
+    </w:p>
+    <w:p>
+      <w:pPr>
+        <w:rPr>
+          <w:rStyle w:val="Titre2Car"/>
+        </w:rPr>
+      </w:pPr>
+      <w:bookmarkStart w:id="12" w:name="_Toc224285656"/>
+      <w:r>
+        <w:rPr>
+          <w:rStyle w:val="Titre2Car"/>
+        </w:rPr>
+        <w:t>Inconvénients</w:t>
+      </w:r>
+      <w:r>
+        <w:rPr>
+          <w:rStyle w:val="Titre2Car"/>
+        </w:rPr>
+        <w:t xml:space="preserve"> </w:t>
+      </w:r>
+      <w:r>
+        <w:rPr>
+          <w:rStyle w:val="Titre2Car"/>
+        </w:rPr>
+        <w:t>:</w:t>
+      </w:r>
+      <w:bookmarkEnd w:id="12"/>
+    </w:p>
+    <w:p>
+      <w:r>
+        <w:t>Toujours</w:t>
+      </w:r>
+      <w:r>
+        <w:t xml:space="preserve"> procédural avec des classes statiques, nombreux passages par </w:t>
+      </w:r>
+      <w:proofErr w:type="spellStart"/>
+      <w:r>
+        <w:t>ref</w:t>
+      </w:r>
+      <w:proofErr w:type="spellEnd"/>
+      <w:r>
+        <w:t>, pas encore de modélisation métier réelle.</w:t>
+      </w:r>
+    </w:p>
+    <w:p>
+      <w:pPr>
+        <w:rPr>
+          <w:rFonts w:asciiTheme="majorHAnsi" w:eastAsiaTheme="majorEastAsia" w:hAnsiTheme="majorHAnsi" w:cstheme="majorBidi"/>
+          <w:color w:val="0F4761" w:themeColor="accent1" w:themeShade="BF"/>
+          <w:sz w:val="40"/>
+          <w:szCs w:val="40"/>
+        </w:rPr>
+      </w:pPr>
+      <w:r>
+        <w:br w:type="page"/>
+      </w:r>
+    </w:p>
+    <w:p>
+      <w:pPr>
+        <w:pStyle w:val="Titre1"/>
+      </w:pPr>
+      <w:bookmarkStart w:id="13" w:name="_Toc224285657"/>
+      <w:r>
+        <w:lastRenderedPageBreak/>
+        <w:t>V2 =&gt; V3</w:t>
+      </w:r>
+      <w:bookmarkEnd w:id="13"/>
+    </w:p>
+    <w:p>
+      <w:pPr>
+        <w:pStyle w:val="Titre2"/>
+      </w:pPr>
+      <w:bookmarkStart w:id="14" w:name="_Toc224285658"/>
+      <w:r>
+        <w:t>Différences</w:t>
+      </w:r>
+      <w:bookmarkEnd w:id="14"/>
+    </w:p>
+    <w:p>
+      <w:r>
+        <w:rPr>
+          <w:b/>
+          <w:bCs/>
+        </w:rPr>
+        <w:t>Architecture</w:t>
+      </w:r>
+      <w:r>
+        <w:t xml:space="preserve"> La V2 utilise des classes statiques sans instanciation. La V3 passe à des classes instanciables avec injection de dépendances (ex. console, </w:t>
+      </w:r>
+      <w:proofErr w:type="spellStart"/>
+      <w:r>
+        <w:t>verification</w:t>
+      </w:r>
+      <w:proofErr w:type="spellEnd"/>
+      <w:r>
+        <w:t xml:space="preserve">, </w:t>
+      </w:r>
+      <w:proofErr w:type="gramStart"/>
+      <w:r>
+        <w:t>transaction passés</w:t>
+      </w:r>
+      <w:proofErr w:type="gramEnd"/>
+      <w:r>
+        <w:t xml:space="preserve"> en paramètres). Le code est plus souple mais plus verbeux.</w:t>
+      </w:r>
+    </w:p>
+    <w:p>
+      <w:r>
+        <w:rPr>
+          <w:b/>
+          <w:bCs/>
+        </w:rPr>
+        <w:t>Modélisation métier</w:t>
+      </w:r>
+      <w:r>
+        <w:t xml:space="preserve"> C'est le changement majeur. La V2 n'a aucun objet métier, juste des données brutes. La V3 introduit </w:t>
+      </w:r>
+      <w:proofErr w:type="spellStart"/>
+      <w:r>
+        <w:t>Account</w:t>
+      </w:r>
+      <w:proofErr w:type="spellEnd"/>
+      <w:r>
+        <w:t xml:space="preserve"> avec héritage vers Child, Teenager, </w:t>
+      </w:r>
+      <w:proofErr w:type="spellStart"/>
+      <w:r>
+        <w:t>Adult</w:t>
+      </w:r>
+      <w:proofErr w:type="spellEnd"/>
+      <w:r>
+        <w:t xml:space="preserve"> et Admin, chacun ayant ses propres règles de retrait via polymorphisme.</w:t>
+      </w:r>
+    </w:p>
+    <w:p>
+      <w:r>
+        <w:rPr>
+          <w:b/>
+          <w:bCs/>
+        </w:rPr>
+        <w:t>Création de compte</w:t>
+      </w:r>
+      <w:r>
+        <w:t xml:space="preserve"> Inexistante en V2, la V3 ajoute </w:t>
+      </w:r>
+      <w:proofErr w:type="spellStart"/>
+      <w:r>
+        <w:t>Factory.CreateAccount</w:t>
+      </w:r>
+      <w:proofErr w:type="spellEnd"/>
+      <w:r>
+        <w:t>() permettant de créer dynamiquement un compte personnalisé avec type, nom, solde et mot de passe.</w:t>
+      </w:r>
+    </w:p>
+    <w:p>
+      <w:r>
+        <w:rPr>
+          <w:b/>
+          <w:bCs/>
+        </w:rPr>
+        <w:t>Authentification</w:t>
+      </w:r>
+      <w:r>
+        <w:t xml:space="preserve"> La V2 compare directement des entiers. La V3 délègue la vérification à </w:t>
+      </w:r>
+      <w:proofErr w:type="spellStart"/>
+      <w:r>
+        <w:t>Account.PasswordMatches</w:t>
+      </w:r>
+      <w:proofErr w:type="spellEnd"/>
+      <w:r>
+        <w:t>() avec une validation via Regex, plus robuste et encapsulée.</w:t>
+      </w:r>
+    </w:p>
+    <w:p>
+      <w:r>
+        <w:rPr>
+          <w:b/>
+          <w:bCs/>
+        </w:rPr>
+        <w:t>Passage de données</w:t>
+      </w:r>
+      <w:r>
+        <w:t xml:space="preserve"> La V2 passe massivement par </w:t>
+      </w:r>
+      <w:proofErr w:type="spellStart"/>
+      <w:r>
+        <w:t>ref</w:t>
+      </w:r>
+      <w:proofErr w:type="spellEnd"/>
+      <w:r>
+        <w:t xml:space="preserve">. La V3 élimine presque tous les </w:t>
+      </w:r>
+      <w:proofErr w:type="spellStart"/>
+      <w:r>
+        <w:t>ref</w:t>
+      </w:r>
+      <w:proofErr w:type="spellEnd"/>
+      <w:r>
+        <w:t xml:space="preserve"> en encapsulant les données dans les objets.</w:t>
+      </w:r>
+    </w:p>
+    <w:p>
+      <w:bookmarkStart w:id="15" w:name="_Toc224285659"/>
+      <w:r>
+        <w:rPr>
+          <w:rStyle w:val="Titre2Car"/>
+        </w:rPr>
+        <w:t>Avantages</w:t>
+      </w:r>
+      <w:r>
+        <w:rPr>
+          <w:rStyle w:val="Titre2Car"/>
+        </w:rPr>
+        <w:t xml:space="preserve"> </w:t>
+      </w:r>
+      <w:r>
+        <w:rPr>
+          <w:rStyle w:val="Titre2Car"/>
+        </w:rPr>
+        <w:t>:</w:t>
+      </w:r>
+      <w:bookmarkEnd w:id="15"/>
+      <w:r>
+        <w:t xml:space="preserve"> </w:t>
+      </w:r>
+    </w:p>
+    <w:p>
+      <w:r>
+        <w:t>O</w:t>
+      </w:r>
+      <w:r>
+        <w:t>rienté objet réel, polymorphisme, encapsulation, extensible, plus proche d'une architecture professionnelle.</w:t>
+      </w:r>
+    </w:p>
+    <w:p>
+      <w:bookmarkStart w:id="16" w:name="_Toc224285660"/>
+      <w:r>
+        <w:rPr>
+          <w:rStyle w:val="Titre2Car"/>
+        </w:rPr>
+        <w:t>Inconvénients</w:t>
+      </w:r>
+      <w:r>
+        <w:rPr>
+          <w:rStyle w:val="Titre2Car"/>
+        </w:rPr>
+        <w:t xml:space="preserve"> </w:t>
+      </w:r>
+      <w:r>
+        <w:rPr>
+          <w:rStyle w:val="Titre2Car"/>
+        </w:rPr>
+        <w:t>:</w:t>
+      </w:r>
+      <w:bookmarkEnd w:id="16"/>
+      <w:r>
+        <w:t xml:space="preserve"> </w:t>
+      </w:r>
+    </w:p>
+    <w:p>
+      <w:r>
+        <w:t>C</w:t>
+      </w:r>
+      <w:r>
+        <w:t xml:space="preserve">omplexité accrue, quelques couplages résiduels comme </w:t>
+      </w:r>
+      <w:proofErr w:type="spellStart"/>
+      <w:r>
+        <w:t>SuperConsole</w:t>
+      </w:r>
+      <w:proofErr w:type="spellEnd"/>
+      <w:r>
+        <w:t xml:space="preserve"> instanciée directement dans Transactions, et </w:t>
+      </w:r>
+      <w:proofErr w:type="spellStart"/>
+      <w:r>
+        <w:t>Factory</w:t>
+      </w:r>
+      <w:proofErr w:type="spellEnd"/>
+      <w:r>
+        <w:t xml:space="preserve"> mélange encore création et affichage.</w:t>
+      </w:r>
+    </w:p>
+    <w:p>
+      <w:pPr>
+        <w:rPr>
+          <w:rFonts w:asciiTheme="majorHAnsi" w:eastAsiaTheme="majorEastAsia" w:hAnsiTheme="majorHAnsi" w:cstheme="majorBidi"/>
+          <w:color w:val="0F4761" w:themeColor="accent1" w:themeShade="BF"/>
+          <w:sz w:val="40"/>
+          <w:szCs w:val="40"/>
+        </w:rPr>
+      </w:pPr>
+      <w:r>
+        <w:br w:type="page"/>
+      </w:r>
+    </w:p>
+    <w:p>
+      <w:pPr>
+        <w:pStyle w:val="Titre1"/>
+      </w:pPr>
+      <w:bookmarkStart w:id="17" w:name="_Toc224285661"/>
+      <w:r>
+        <w:lastRenderedPageBreak/>
+        <w:t>Conclusion</w:t>
+      </w:r>
+      <w:bookmarkEnd w:id="17"/>
+    </w:p>
+    <w:p>
+      <w:r>
+        <w:t xml:space="preserve">L'évolution de ce projet illustre bien la progression d'un développeur. La V1, </w:t>
+      </w:r>
+      <w:r>
+        <w:t>ancienne</w:t>
+      </w:r>
+      <w:r>
+        <w:t xml:space="preserve"> mais fonctionnelle, pose les bases. La V2 démontre un</w:t>
+      </w:r>
+      <w:r>
+        <w:t xml:space="preserve"> apprentissage </w:t>
+      </w:r>
+      <w:r>
+        <w:t>de l'importance de l'organisation du code en séparant les responsabilités. La V3 franchit un cap décisif en adoptant une véritable approche orientée objet avec héritage et polymorphisme.</w:t>
+      </w:r>
+    </w:p>
+    <w:p>
+      <w:r>
+        <w:t xml:space="preserve">Ce qui est remarquable, c'est que la logique métier reste cohérente tout au long des versions — c'est uniquement la </w:t>
+      </w:r>
+      <w:r>
+        <w:rPr>
+          <w:b/>
+          <w:bCs/>
+        </w:rPr>
+        <w:t>façon de la structurer</w:t>
+      </w:r>
+      <w:r>
+        <w:t xml:space="preserve"> qui évolue. C'est exactement le cheminement attendu dans l'apprentissage du développement logiciel : d'abord faire fonctionner, puis bien organiser, enfin bien concevoir.</w:t>
       </w:r>
     </w:p>
     <w:sectPr>
+      <w:headerReference w:type="default" r:id="rId12"/>
+      <w:footerReference w:type="default" r:id="rId13"/>
+      <w:headerReference w:type="first" r:id="rId14"/>
+      <w:footerReference w:type="first" r:id="rId15"/>
       <w:pgSz w:w="11906" w:h="16838"/>
       <w:pgMar w:top="1417" w:right="1417" w:bottom="1417" w:left="1417" w:header="708" w:footer="708" w:gutter="0"/>
-      <w:pgNumType w:start="0"/>
+      <w:pgNumType w:start="1"/>
       <w:cols w:space="708"/>
       <w:titlePg/>
       <w:docGrid w:linePitch="360"/>
     </w:sectPr>
   </w:body>
 </w:document>
+</file>
+
+<file path=word/endnotes.xml><?xml version="1.0" encoding="utf-8"?>
+<w:endnotes xmlns:wpc="http://schemas.microsoft.com/office/word/2010/wordprocessingCanvas" xmlns:cx="http://schemas.microsoft.com/office/drawing/2014/chartex" xmlns:cx1="http://schemas.microsoft.com/office/drawing/2015/9/8/chartex" xmlns:cx2="http://schemas.microsoft.com/office/drawing/2015/10/21/chartex" xmlns:cx3="http://schemas.microsoft.com/office/drawing/2016/5/9/chartex" xmlns:cx4="http://schemas.microsoft.com/office/drawing/2016/5/10/chartex" xmlns:cx5="http://schemas.microsoft.com/office/drawing/2016/5/11/chartex" xmlns:cx6="http://schemas.microsoft.com/office/drawing/2016/5/12/chartex" xmlns:cx7="http://schemas.microsoft.com/office/drawing/2016/5/13/chartex" xmlns:cx8="http://schemas.microsoft.com/office/drawing/2016/5/14/chartex" xmlns:mc="http://schemas.openxmlformats.org/markup-compatibility/2006" xmlns:aink="http://schemas.microsoft.com/office/drawing/2016/ink" xmlns:am3d="http://schemas.microsoft.com/office/drawing/2017/model3d" xmlns:o="urn:schemas-microsoft-com:office:office" xmlns:oel="http://schemas.microsoft.com/office/2019/extlst" xmlns:r="http://schemas.openxmlformats.org/officeDocument/2006/relationships" xmlns:m="http://schemas.openxmlformats.org/officeDocument/2006/math" xmlns:v="urn:schemas-microsoft-com:vml" xmlns:wp14="http://schemas.microsoft.com/office/word/2010/wordprocessingDrawing" xmlns:wp="http://schemas.openxmlformats.org/drawingml/2006/wordprocessingDrawing" xmlns:w10="urn:schemas-microsoft-com:office:word" xmlns:w="http://schemas.openxmlformats.org/wordprocessingml/2006/main" xmlns:w14="http://schemas.microsoft.com/office/word/2010/wordml" xmlns:w15="http://schemas.microsoft.com/office/word/2012/wordml" xmlns:w16cex="http://schemas.microsoft.com/office/word/2018/wordml/cex" xmlns:w16cid="http://schemas.microsoft.com/office/word/2016/wordml/cid" xmlns:w16="http://schemas.microsoft.com/office/word/2018/wordml" xmlns:w16sdtdh="http://schemas.microsoft.com/office/word/2020/wordml/sdtdatahash" xmlns:w16se="http://schemas.microsoft.com/office/word/2015/wordml/symex" xmlns:wpg="http://schemas.microsoft.com/office/word/2010/wordprocessingGroup" xmlns:wpi="http://schemas.microsoft.com/office/word/2010/wordprocessingInk" xmlns:wne="http://schemas.microsoft.com/office/word/2006/wordml" xmlns:wps="http://schemas.microsoft.com/office/word/2010/wordprocessingShape" mc:Ignorable="w14 w15 w16se w16cid w16 w16cex w16sdtdh wp14">
+  <w:endnote w:type="separator" w:id="-1">
+    <w:p>
+      <w:pPr>
+        <w:spacing w:after="0" w:line="240" w:lineRule="auto"/>
+      </w:pPr>
+      <w:r>
+        <w:separator/>
+      </w:r>
+    </w:p>
+  </w:endnote>
+  <w:endnote w:type="continuationSeparator" w:id="0">
+    <w:p>
+      <w:pPr>
+        <w:spacing w:after="0" w:line="240" w:lineRule="auto"/>
+      </w:pPr>
+      <w:r>
+        <w:continuationSeparator/>
+      </w:r>
+    </w:p>
+  </w:endnote>
+</w:endnotes>
+</file>
+
+<file path=word/footer1.xml><?xml version="1.0" encoding="utf-8"?>
+<w:ftr xmlns:wpc="http://schemas.microsoft.com/office/word/2010/wordprocessingCanvas" xmlns:cx="http://schemas.microsoft.com/office/drawing/2014/chartex" xmlns:cx1="http://schemas.microsoft.com/office/drawing/2015/9/8/chartex" xmlns:cx2="http://schemas.microsoft.com/office/drawing/2015/10/21/chartex" xmlns:cx3="http://schemas.microsoft.com/office/drawing/2016/5/9/chartex" xmlns:cx4="http://schemas.microsoft.com/office/drawing/2016/5/10/chartex" xmlns:cx5="http://schemas.microsoft.com/office/drawing/2016/5/11/chartex" xmlns:cx6="http://schemas.microsoft.com/office/drawing/2016/5/12/chartex" xmlns:cx7="http://schemas.microsoft.com/office/drawing/2016/5/13/chartex" xmlns:cx8="http://schemas.microsoft.com/office/drawing/2016/5/14/chartex" xmlns:mc="http://schemas.openxmlformats.org/markup-compatibility/2006" xmlns:aink="http://schemas.microsoft.com/office/drawing/2016/ink" xmlns:am3d="http://schemas.microsoft.com/office/drawing/2017/model3d" xmlns:o="urn:schemas-microsoft-com:office:office" xmlns:oel="http://schemas.microsoft.com/office/2019/extlst" xmlns:r="http://schemas.openxmlformats.org/officeDocument/2006/relationships" xmlns:m="http://schemas.openxmlformats.org/officeDocument/2006/math" xmlns:v="urn:schemas-microsoft-com:vml" xmlns:wp14="http://schemas.microsoft.com/office/word/2010/wordprocessingDrawing" xmlns:wp="http://schemas.openxmlformats.org/drawingml/2006/wordprocessingDrawing" xmlns:w10="urn:schemas-microsoft-com:office:word" xmlns:w="http://schemas.openxmlformats.org/wordprocessingml/2006/main" xmlns:w14="http://schemas.microsoft.com/office/word/2010/wordml" xmlns:w15="http://schemas.microsoft.com/office/word/2012/wordml" xmlns:w16cex="http://schemas.microsoft.com/office/word/2018/wordml/cex" xmlns:w16cid="http://schemas.microsoft.com/office/word/2016/wordml/cid" xmlns:w16="http://schemas.microsoft.com/office/word/2018/wordml" xmlns:w16sdtdh="http://schemas.microsoft.com/office/word/2020/wordml/sdtdatahash" xmlns:w16se="http://schemas.microsoft.com/office/word/2015/wordml/symex" xmlns:wpg="http://schemas.microsoft.com/office/word/2010/wordprocessingGroup" xmlns:wpi="http://schemas.microsoft.com/office/word/2010/wordprocessingInk" xmlns:wne="http://schemas.microsoft.com/office/word/2006/wordml" xmlns:wps="http://schemas.microsoft.com/office/word/2010/wordprocessingShape" mc:Ignorable="w14 w15 w16se w16cid w16 w16cex w16sdtdh wp14">
+  <w:p>
+    <w:pPr>
+      <w:pStyle w:val="Pieddepage"/>
+      <w:jc w:val="center"/>
+    </w:pPr>
+  </w:p>
+</w:ftr>
+</file>
+
+<file path=word/footer2.xml><?xml version="1.0" encoding="utf-8"?>
+<w:ftr xmlns:wpc="http://schemas.microsoft.com/office/word/2010/wordprocessingCanvas" xmlns:cx="http://schemas.microsoft.com/office/drawing/2014/chartex" xmlns:cx1="http://schemas.microsoft.com/office/drawing/2015/9/8/chartex" xmlns:cx2="http://schemas.microsoft.com/office/drawing/2015/10/21/chartex" xmlns:cx3="http://schemas.microsoft.com/office/drawing/2016/5/9/chartex" xmlns:cx4="http://schemas.microsoft.com/office/drawing/2016/5/10/chartex" xmlns:cx5="http://schemas.microsoft.com/office/drawing/2016/5/11/chartex" xmlns:cx6="http://schemas.microsoft.com/office/drawing/2016/5/12/chartex" xmlns:cx7="http://schemas.microsoft.com/office/drawing/2016/5/13/chartex" xmlns:cx8="http://schemas.microsoft.com/office/drawing/2016/5/14/chartex" xmlns:mc="http://schemas.openxmlformats.org/markup-compatibility/2006" xmlns:aink="http://schemas.microsoft.com/office/drawing/2016/ink" xmlns:am3d="http://schemas.microsoft.com/office/drawing/2017/model3d" xmlns:o="urn:schemas-microsoft-com:office:office" xmlns:oel="http://schemas.microsoft.com/office/2019/extlst" xmlns:r="http://schemas.openxmlformats.org/officeDocument/2006/relationships" xmlns:m="http://schemas.openxmlformats.org/officeDocument/2006/math" xmlns:v="urn:schemas-microsoft-com:vml" xmlns:wp14="http://schemas.microsoft.com/office/word/2010/wordprocessingDrawing" xmlns:wp="http://schemas.openxmlformats.org/drawingml/2006/wordprocessingDrawing" xmlns:w10="urn:schemas-microsoft-com:office:word" xmlns:w="http://schemas.openxmlformats.org/wordprocessingml/2006/main" xmlns:w14="http://schemas.microsoft.com/office/word/2010/wordml" xmlns:w15="http://schemas.microsoft.com/office/word/2012/wordml" xmlns:w16cex="http://schemas.microsoft.com/office/word/2018/wordml/cex" xmlns:w16cid="http://schemas.microsoft.com/office/word/2016/wordml/cid" xmlns:w16="http://schemas.microsoft.com/office/word/2018/wordml" xmlns:w16sdtdh="http://schemas.microsoft.com/office/word/2020/wordml/sdtdatahash" xmlns:w16se="http://schemas.microsoft.com/office/word/2015/wordml/symex" xmlns:wpg="http://schemas.microsoft.com/office/word/2010/wordprocessingGroup" xmlns:wpi="http://schemas.microsoft.com/office/word/2010/wordprocessingInk" xmlns:wne="http://schemas.microsoft.com/office/word/2006/wordml" xmlns:wps="http://schemas.microsoft.com/office/word/2010/wordprocessingShape" mc:Ignorable="w14 w15 w16se w16cid w16 w16cex w16sdtdh wp14">
+  <w:p>
+    <w:pPr>
+      <w:pStyle w:val="Pieddepage"/>
+    </w:pPr>
+    <w:r>
+      <w:tab/>
+    </w:r>
+    <w:sdt>
+      <w:sdtPr>
+        <w:id w:val="-1319726296"/>
+        <w:docPartObj>
+          <w:docPartGallery w:val="Page Numbers (Bottom of Page)"/>
+          <w:docPartUnique/>
+        </w:docPartObj>
+      </w:sdtPr>
+      <w:sdtContent>
+        <w:r>
+          <w:fldChar w:fldCharType="begin"/>
+        </w:r>
+        <w:r>
+          <w:instrText>PAGE   \* MERGEFORMAT</w:instrText>
+        </w:r>
+        <w:r>
+          <w:fldChar w:fldCharType="separate"/>
+        </w:r>
+        <w:r>
+          <w:rPr>
+            <w:lang w:val="fr-FR"/>
+          </w:rPr>
+          <w:t>2</w:t>
+        </w:r>
+        <w:r>
+          <w:fldChar w:fldCharType="end"/>
+        </w:r>
+      </w:sdtContent>
+    </w:sdt>
+  </w:p>
+</w:ftr>
+</file>
+
+<file path=word/footer3.xml><?xml version="1.0" encoding="utf-8"?>
+<w:ftr xmlns:wpc="http://schemas.microsoft.com/office/word/2010/wordprocessingCanvas" xmlns:cx="http://schemas.microsoft.com/office/drawing/2014/chartex" xmlns:cx1="http://schemas.microsoft.com/office/drawing/2015/9/8/chartex" xmlns:cx2="http://schemas.microsoft.com/office/drawing/2015/10/21/chartex" xmlns:cx3="http://schemas.microsoft.com/office/drawing/2016/5/9/chartex" xmlns:cx4="http://schemas.microsoft.com/office/drawing/2016/5/10/chartex" xmlns:cx5="http://schemas.microsoft.com/office/drawing/2016/5/11/chartex" xmlns:cx6="http://schemas.microsoft.com/office/drawing/2016/5/12/chartex" xmlns:cx7="http://schemas.microsoft.com/office/drawing/2016/5/13/chartex" xmlns:cx8="http://schemas.microsoft.com/office/drawing/2016/5/14/chartex" xmlns:mc="http://schemas.openxmlformats.org/markup-compatibility/2006" xmlns:aink="http://schemas.microsoft.com/office/drawing/2016/ink" xmlns:am3d="http://schemas.microsoft.com/office/drawing/2017/model3d" xmlns:o="urn:schemas-microsoft-com:office:office" xmlns:oel="http://schemas.microsoft.com/office/2019/extlst" xmlns:r="http://schemas.openxmlformats.org/officeDocument/2006/relationships" xmlns:m="http://schemas.openxmlformats.org/officeDocument/2006/math" xmlns:v="urn:schemas-microsoft-com:vml" xmlns:wp14="http://schemas.microsoft.com/office/word/2010/wordprocessingDrawing" xmlns:wp="http://schemas.openxmlformats.org/drawingml/2006/wordprocessingDrawing" xmlns:w10="urn:schemas-microsoft-com:office:word" xmlns:w="http://schemas.openxmlformats.org/wordprocessingml/2006/main" xmlns:w14="http://schemas.microsoft.com/office/word/2010/wordml" xmlns:w15="http://schemas.microsoft.com/office/word/2012/wordml" xmlns:w16cex="http://schemas.microsoft.com/office/word/2018/wordml/cex" xmlns:w16cid="http://schemas.microsoft.com/office/word/2016/wordml/cid" xmlns:w16="http://schemas.microsoft.com/office/word/2018/wordml" xmlns:w16sdtdh="http://schemas.microsoft.com/office/word/2020/wordml/sdtdatahash" xmlns:w16se="http://schemas.microsoft.com/office/word/2015/wordml/symex" xmlns:wpg="http://schemas.microsoft.com/office/word/2010/wordprocessingGroup" xmlns:wpi="http://schemas.microsoft.com/office/word/2010/wordprocessingInk" xmlns:wne="http://schemas.microsoft.com/office/word/2006/wordml" xmlns:wps="http://schemas.microsoft.com/office/word/2010/wordprocessingShape" mc:Ignorable="w14 w15 w16se w16cid w16 w16cex w16sdtdh wp14">
+  <w:sdt>
+    <w:sdtPr>
+      <w:id w:val="-2035720420"/>
+      <w:docPartObj>
+        <w:docPartGallery w:val="Page Numbers (Bottom of Page)"/>
+        <w:docPartUnique/>
+      </w:docPartObj>
+    </w:sdtPr>
+    <w:sdtContent>
+      <w:p>
+        <w:pPr>
+          <w:pStyle w:val="Pieddepage"/>
+          <w:jc w:val="center"/>
+        </w:pPr>
+        <w:r>
+          <w:fldChar w:fldCharType="begin"/>
+        </w:r>
+        <w:r>
+          <w:instrText>PAGE   \* MERGEFORMAT</w:instrText>
+        </w:r>
+        <w:r>
+          <w:fldChar w:fldCharType="separate"/>
+        </w:r>
+        <w:r>
+          <w:rPr>
+            <w:lang w:val="fr-FR"/>
+          </w:rPr>
+          <w:t>2</w:t>
+        </w:r>
+        <w:r>
+          <w:fldChar w:fldCharType="end"/>
+        </w:r>
+      </w:p>
+    </w:sdtContent>
+  </w:sdt>
+</w:ftr>
+</file>
+
+<file path=word/footnotes.xml><?xml version="1.0" encoding="utf-8"?>
+<w:footnotes xmlns:wpc="http://schemas.microsoft.com/office/word/2010/wordprocessingCanvas" xmlns:cx="http://schemas.microsoft.com/office/drawing/2014/chartex" xmlns:cx1="http://schemas.microsoft.com/office/drawing/2015/9/8/chartex" xmlns:cx2="http://schemas.microsoft.com/office/drawing/2015/10/21/chartex" xmlns:cx3="http://schemas.microsoft.com/office/drawing/2016/5/9/chartex" xmlns:cx4="http://schemas.microsoft.com/office/drawing/2016/5/10/chartex" xmlns:cx5="http://schemas.microsoft.com/office/drawing/2016/5/11/chartex" xmlns:cx6="http://schemas.microsoft.com/office/drawing/2016/5/12/chartex" xmlns:cx7="http://schemas.microsoft.com/office/drawing/2016/5/13/chartex" xmlns:cx8="http://schemas.microsoft.com/office/drawing/2016/5/14/chartex" xmlns:mc="http://schemas.openxmlformats.org/markup-compatibility/2006" xmlns:aink="http://schemas.microsoft.com/office/drawing/2016/ink" xmlns:am3d="http://schemas.microsoft.com/office/drawing/2017/model3d" xmlns:o="urn:schemas-microsoft-com:office:office" xmlns:oel="http://schemas.microsoft.com/office/2019/extlst" xmlns:r="http://schemas.openxmlformats.org/officeDocument/2006/relationships" xmlns:m="http://schemas.openxmlformats.org/officeDocument/2006/math" xmlns:v="urn:schemas-microsoft-com:vml" xmlns:wp14="http://schemas.microsoft.com/office/word/2010/wordprocessingDrawing" xmlns:wp="http://schemas.openxmlformats.org/drawingml/2006/wordprocessingDrawing" xmlns:w10="urn:schemas-microsoft-com:office:word" xmlns:w="http://schemas.openxmlformats.org/wordprocessingml/2006/main" xmlns:w14="http://schemas.microsoft.com/office/word/2010/wordml" xmlns:w15="http://schemas.microsoft.com/office/word/2012/wordml" xmlns:w16cex="http://schemas.microsoft.com/office/word/2018/wordml/cex" xmlns:w16cid="http://schemas.microsoft.com/office/word/2016/wordml/cid" xmlns:w16="http://schemas.microsoft.com/office/word/2018/wordml" xmlns:w16sdtdh="http://schemas.microsoft.com/office/word/2020/wordml/sdtdatahash" xmlns:w16se="http://schemas.microsoft.com/office/word/2015/wordml/symex" xmlns:wpg="http://schemas.microsoft.com/office/word/2010/wordprocessingGroup" xmlns:wpi="http://schemas.microsoft.com/office/word/2010/wordprocessingInk" xmlns:wne="http://schemas.microsoft.com/office/word/2006/wordml" xmlns:wps="http://schemas.microsoft.com/office/word/2010/wordprocessingShape" mc:Ignorable="w14 w15 w16se w16cid w16 w16cex w16sdtdh wp14">
+  <w:footnote w:type="separator" w:id="-1">
+    <w:p>
+      <w:pPr>
+        <w:spacing w:after="0" w:line="240" w:lineRule="auto"/>
+      </w:pPr>
+      <w:r>
+        <w:separator/>
+      </w:r>
+    </w:p>
+  </w:footnote>
+  <w:footnote w:type="continuationSeparator" w:id="0">
+    <w:p>
+      <w:pPr>
+        <w:spacing w:after="0" w:line="240" w:lineRule="auto"/>
+      </w:pPr>
+      <w:r>
+        <w:continuationSeparator/>
+      </w:r>
+    </w:p>
+  </w:footnote>
+</w:footnotes>
+</file>
+
+<file path=word/header1.xml><?xml version="1.0" encoding="utf-8"?>
+<w:hdr xmlns:wpc="http://schemas.microsoft.com/office/word/2010/wordprocessingCanvas" xmlns:cx="http://schemas.microsoft.com/office/drawing/2014/chartex" xmlns:cx1="http://schemas.microsoft.com/office/drawing/2015/9/8/chartex" xmlns:cx2="http://schemas.microsoft.com/office/drawing/2015/10/21/chartex" xmlns:cx3="http://schemas.microsoft.com/office/drawing/2016/5/9/chartex" xmlns:cx4="http://schemas.microsoft.com/office/drawing/2016/5/10/chartex" xmlns:cx5="http://schemas.microsoft.com/office/drawing/2016/5/11/chartex" xmlns:cx6="http://schemas.microsoft.com/office/drawing/2016/5/12/chartex" xmlns:cx7="http://schemas.microsoft.com/office/drawing/2016/5/13/chartex" xmlns:cx8="http://schemas.microsoft.com/office/drawing/2016/5/14/chartex" xmlns:mc="http://schemas.openxmlformats.org/markup-compatibility/2006" xmlns:aink="http://schemas.microsoft.com/office/drawing/2016/ink" xmlns:am3d="http://schemas.microsoft.com/office/drawing/2017/model3d" xmlns:o="urn:schemas-microsoft-com:office:office" xmlns:oel="http://schemas.microsoft.com/office/2019/extlst" xmlns:r="http://schemas.openxmlformats.org/officeDocument/2006/relationships" xmlns:m="http://schemas.openxmlformats.org/officeDocument/2006/math" xmlns:v="urn:schemas-microsoft-com:vml" xmlns:wp14="http://schemas.microsoft.com/office/word/2010/wordprocessingDrawing" xmlns:wp="http://schemas.openxmlformats.org/drawingml/2006/wordprocessingDrawing" xmlns:w10="urn:schemas-microsoft-com:office:word" xmlns:w="http://schemas.openxmlformats.org/wordprocessingml/2006/main" xmlns:w14="http://schemas.microsoft.com/office/word/2010/wordml" xmlns:w15="http://schemas.microsoft.com/office/word/2012/wordml" xmlns:w16cex="http://schemas.microsoft.com/office/word/2018/wordml/cex" xmlns:w16cid="http://schemas.microsoft.com/office/word/2016/wordml/cid" xmlns:w16="http://schemas.microsoft.com/office/word/2018/wordml" xmlns:w16sdtdh="http://schemas.microsoft.com/office/word/2020/wordml/sdtdatahash" xmlns:w16se="http://schemas.microsoft.com/office/word/2015/wordml/symex" xmlns:wpg="http://schemas.microsoft.com/office/word/2010/wordprocessingGroup" xmlns:wpi="http://schemas.microsoft.com/office/word/2010/wordprocessingInk" xmlns:wne="http://schemas.microsoft.com/office/word/2006/wordml" xmlns:wps="http://schemas.microsoft.com/office/word/2010/wordprocessingShape" mc:Ignorable="w14 w15 w16se w16cid w16 w16cex w16sdtdh wp14">
+  <w:p>
+    <w:pPr>
+      <w:pStyle w:val="En-tte"/>
+    </w:pPr>
+    <w:r>
+      <w:t>Kentin Fankhauser</w:t>
+    </w:r>
+    <w:r>
+      <w:tab/>
+    </w:r>
+    <w:r>
+      <w:tab/>
+      <w:t>FID1</w:t>
+    </w:r>
+  </w:p>
+</w:hdr>
+</file>
+
+<file path=word/header2.xml><?xml version="1.0" encoding="utf-8"?>
+<w:hdr xmlns:wpc="http://schemas.microsoft.com/office/word/2010/wordprocessingCanvas" xmlns:cx="http://schemas.microsoft.com/office/drawing/2014/chartex" xmlns:cx1="http://schemas.microsoft.com/office/drawing/2015/9/8/chartex" xmlns:cx2="http://schemas.microsoft.com/office/drawing/2015/10/21/chartex" xmlns:cx3="http://schemas.microsoft.com/office/drawing/2016/5/9/chartex" xmlns:cx4="http://schemas.microsoft.com/office/drawing/2016/5/10/chartex" xmlns:cx5="http://schemas.microsoft.com/office/drawing/2016/5/11/chartex" xmlns:cx6="http://schemas.microsoft.com/office/drawing/2016/5/12/chartex" xmlns:cx7="http://schemas.microsoft.com/office/drawing/2016/5/13/chartex" xmlns:cx8="http://schemas.microsoft.com/office/drawing/2016/5/14/chartex" xmlns:mc="http://schemas.openxmlformats.org/markup-compatibility/2006" xmlns:aink="http://schemas.microsoft.com/office/drawing/2016/ink" xmlns:am3d="http://schemas.microsoft.com/office/drawing/2017/model3d" xmlns:o="urn:schemas-microsoft-com:office:office" xmlns:oel="http://schemas.microsoft.com/office/2019/extlst" xmlns:r="http://schemas.openxmlformats.org/officeDocument/2006/relationships" xmlns:m="http://schemas.openxmlformats.org/officeDocument/2006/math" xmlns:v="urn:schemas-microsoft-com:vml" xmlns:wp14="http://schemas.microsoft.com/office/word/2010/wordprocessingDrawing" xmlns:wp="http://schemas.openxmlformats.org/drawingml/2006/wordprocessingDrawing" xmlns:w10="urn:schemas-microsoft-com:office:word" xmlns:w="http://schemas.openxmlformats.org/wordprocessingml/2006/main" xmlns:w14="http://schemas.microsoft.com/office/word/2010/wordml" xmlns:w15="http://schemas.microsoft.com/office/word/2012/wordml" xmlns:w16cex="http://schemas.microsoft.com/office/word/2018/wordml/cex" xmlns:w16cid="http://schemas.microsoft.com/office/word/2016/wordml/cid" xmlns:w16="http://schemas.microsoft.com/office/word/2018/wordml" xmlns:w16sdtdh="http://schemas.microsoft.com/office/word/2020/wordml/sdtdatahash" xmlns:w16se="http://schemas.microsoft.com/office/word/2015/wordml/symex" xmlns:wpg="http://schemas.microsoft.com/office/word/2010/wordprocessingGroup" xmlns:wpi="http://schemas.microsoft.com/office/word/2010/wordprocessingInk" xmlns:wne="http://schemas.microsoft.com/office/word/2006/wordml" xmlns:wps="http://schemas.microsoft.com/office/word/2010/wordprocessingShape" mc:Ignorable="w14 w15 w16se w16cid w16 w16cex w16sdtdh wp14">
+  <w:p>
+    <w:pPr>
+      <w:pStyle w:val="En-tte"/>
+    </w:pPr>
+    <w:r>
+      <w:t>Kentin Fankhauser</w:t>
+    </w:r>
+    <w:r>
+      <w:tab/>
+    </w:r>
+    <w:r>
+      <w:tab/>
+      <w:t>FID1</w:t>
+    </w:r>
+  </w:p>
+</w:hdr>
 </file>
 
 <file path=word/styles.xml><?xml version="1.0" encoding="utf-8"?>
@@ -1222,6 +3366,7 @@
   <w:style w:type="paragraph" w:default="1" w:styleId="Normal">
     <w:name w:val="Normal"/>
     <w:qFormat/>
+    <w:rsid w:val="00AA2151"/>
   </w:style>
   <w:style w:type="paragraph" w:styleId="Titre1">
     <w:name w:val="heading 1"/>
@@ -1424,7 +3569,6 @@
   <w:style w:type="character" w:default="1" w:styleId="Policepardfaut">
     <w:name w:val="Default Paragraph Font"/>
     <w:uiPriority w:val="1"/>
-    <w:semiHidden/>
     <w:unhideWhenUsed/>
   </w:style>
   <w:style w:type="table" w:default="1" w:styleId="TableauNormal">
@@ -1821,6 +3965,63 @@
       <w:rFonts w:ascii="Arial" w:hAnsi="Arial"/>
     </w:rPr>
   </w:style>
+  <w:style w:type="paragraph" w:styleId="TM2">
+    <w:name w:val="toc 2"/>
+    <w:basedOn w:val="Normal"/>
+    <w:next w:val="Normal"/>
+    <w:autoRedefine/>
+    <w:uiPriority w:val="39"/>
+    <w:unhideWhenUsed/>
+    <w:rsid w:val="007C4457"/>
+    <w:pPr>
+      <w:spacing w:after="100"/>
+      <w:ind w:left="240"/>
+    </w:pPr>
+  </w:style>
+  <w:style w:type="paragraph" w:styleId="En-tte">
+    <w:name w:val="header"/>
+    <w:basedOn w:val="Normal"/>
+    <w:link w:val="En-tteCar"/>
+    <w:uiPriority w:val="99"/>
+    <w:unhideWhenUsed/>
+    <w:rsid w:val="009005AF"/>
+    <w:pPr>
+      <w:tabs>
+        <w:tab w:val="center" w:pos="4536"/>
+        <w:tab w:val="right" w:pos="9072"/>
+      </w:tabs>
+      <w:spacing w:after="0" w:line="240" w:lineRule="auto"/>
+    </w:pPr>
+  </w:style>
+  <w:style w:type="character" w:customStyle="1" w:styleId="En-tteCar">
+    <w:name w:val="En-tête Car"/>
+    <w:basedOn w:val="Policepardfaut"/>
+    <w:link w:val="En-tte"/>
+    <w:uiPriority w:val="99"/>
+    <w:rsid w:val="009005AF"/>
+  </w:style>
+  <w:style w:type="paragraph" w:styleId="Pieddepage">
+    <w:name w:val="footer"/>
+    <w:basedOn w:val="Normal"/>
+    <w:link w:val="PieddepageCar"/>
+    <w:uiPriority w:val="99"/>
+    <w:unhideWhenUsed/>
+    <w:rsid w:val="009005AF"/>
+    <w:pPr>
+      <w:tabs>
+        <w:tab w:val="center" w:pos="4536"/>
+        <w:tab w:val="right" w:pos="9072"/>
+      </w:tabs>
+      <w:spacing w:after="0" w:line="240" w:lineRule="auto"/>
+    </w:pPr>
+  </w:style>
+  <w:style w:type="character" w:customStyle="1" w:styleId="PieddepageCar">
+    <w:name w:val="Pied de page Car"/>
+    <w:basedOn w:val="Policepardfaut"/>
+    <w:link w:val="Pieddepage"/>
+    <w:uiPriority w:val="99"/>
+    <w:rsid w:val="009005AF"/>
+  </w:style>
 </w:styles>
 </file>
 
@@ -2120,6 +4321,14 @@
 </file>
 
 <file path=customXml/item1.xml><?xml version="1.0" encoding="utf-8"?>
+<p:properties xmlns:p="http://schemas.microsoft.com/office/2006/metadata/properties" xmlns:xsi="http://www.w3.org/2001/XMLSchema-instance" xmlns:pc="http://schemas.microsoft.com/office/infopath/2007/PartnerControls">
+  <documentManagement>
+    <_activity xmlns="83f9d718-8695-44fe-93c7-a4e5ea258f1b" xsi:nil="true"/>
+  </documentManagement>
+</p:properties>
+</file>
+
+<file path=customXml/item2.xml><?xml version="1.0" encoding="utf-8"?>
 <?mso-contentType ?>
 <FormTemplates xmlns="http://schemas.microsoft.com/sharepoint/v3/contenttype/forms">
   <Display>DocumentLibraryForm</Display>
@@ -2128,19 +4337,7 @@
 </FormTemplates>
 </file>
 
-<file path=customXml/item2.xml><?xml version="1.0" encoding="utf-8"?>
-<p:properties xmlns:p="http://schemas.microsoft.com/office/2006/metadata/properties" xmlns:xsi="http://www.w3.org/2001/XMLSchema-instance" xmlns:pc="http://schemas.microsoft.com/office/infopath/2007/PartnerControls">
-  <documentManagement>
-    <_activity xmlns="83f9d718-8695-44fe-93c7-a4e5ea258f1b" xsi:nil="true"/>
-  </documentManagement>
-</p:properties>
-</file>
-
 <file path=customXml/item3.xml><?xml version="1.0" encoding="utf-8"?>
-<b:Sources xmlns:b="http://schemas.openxmlformats.org/officeDocument/2006/bibliography" xmlns="http://schemas.openxmlformats.org/officeDocument/2006/bibliography" SelectedStyle="\APASixthEditionOfficeOnline.xsl" StyleName="APA" Version="6"/>
-</file>
-
-<file path=customXml/item4.xml><?xml version="1.0" encoding="utf-8"?>
 <ct:contentTypeSchema xmlns:ct="http://schemas.microsoft.com/office/2006/metadata/contentType" xmlns:ma="http://schemas.microsoft.com/office/2006/metadata/properties/metaAttributes" ct:_="" ma:_="" ma:contentTypeName="Document" ma:contentTypeID="0x0101008FCB22F1547D7D4F82919EC743CAACBC" ma:contentTypeVersion="17" ma:contentTypeDescription="Crée un document." ma:contentTypeScope="" ma:versionID="aa8a16242235505fd8e8c3689b4ff504">
   <xsd:schema xmlns:xsd="http://www.w3.org/2001/XMLSchema" xmlns:xs="http://www.w3.org/2001/XMLSchema" xmlns:p="http://schemas.microsoft.com/office/2006/metadata/properties" xmlns:ns3="83f9d718-8695-44fe-93c7-a4e5ea258f1b" xmlns:ns4="aaa9772f-a032-4180-ab8e-8699b78d9e7a" targetNamespace="http://schemas.microsoft.com/office/2006/metadata/properties" ma:root="true" ma:fieldsID="508dcb9d59a7003de944be2c00e12f88" ns3:_="" ns4:_="">
     <xsd:import namespace="83f9d718-8695-44fe-93c7-a4e5ea258f1b"/>
@@ -2387,15 +4584,11 @@
 </ct:contentTypeSchema>
 </file>
 
-<file path=customXml/itemProps1.xml><?xml version="1.0" encoding="utf-8"?>
-<ds:datastoreItem xmlns:ds="http://schemas.openxmlformats.org/officeDocument/2006/customXml" ds:itemID="{3F059DC9-A0F2-46E5-9FF4-94E5C580138D}">
-  <ds:schemaRefs>
-    <ds:schemaRef ds:uri="http://schemas.microsoft.com/sharepoint/v3/contenttype/forms"/>
-  </ds:schemaRefs>
-</ds:datastoreItem>
+<file path=customXml/item4.xml><?xml version="1.0" encoding="utf-8"?>
+<b:Sources xmlns:b="http://schemas.openxmlformats.org/officeDocument/2006/bibliography" xmlns="http://schemas.openxmlformats.org/officeDocument/2006/bibliography" SelectedStyle="\APASixthEditionOfficeOnline.xsl" StyleName="APA" Version="6"/>
 </file>
 
-<file path=customXml/itemProps2.xml><?xml version="1.0" encoding="utf-8"?>
+<file path=customXml/itemProps1.xml><?xml version="1.0" encoding="utf-8"?>
 <ds:datastoreItem xmlns:ds="http://schemas.openxmlformats.org/officeDocument/2006/customXml" ds:itemID="{03FE21A9-7FCA-4441-94C6-1629FB7A5C57}">
   <ds:schemaRefs>
     <ds:schemaRef ds:uri="http://schemas.microsoft.com/office/2006/metadata/properties"/>
@@ -2405,15 +4598,15 @@
 </ds:datastoreItem>
 </file>
 
-<file path=customXml/itemProps3.xml><?xml version="1.0" encoding="utf-8"?>
-<ds:datastoreItem xmlns:ds="http://schemas.openxmlformats.org/officeDocument/2006/customXml" ds:itemID="{8D5DC332-1805-4342-B2BA-89BF91289DE0}">
+<file path=customXml/itemProps2.xml><?xml version="1.0" encoding="utf-8"?>
+<ds:datastoreItem xmlns:ds="http://schemas.openxmlformats.org/officeDocument/2006/customXml" ds:itemID="{3F059DC9-A0F2-46E5-9FF4-94E5C580138D}">
   <ds:schemaRefs>
-    <ds:schemaRef ds:uri="http://schemas.openxmlformats.org/officeDocument/2006/bibliography"/>
+    <ds:schemaRef ds:uri="http://schemas.microsoft.com/sharepoint/v3/contenttype/forms"/>
   </ds:schemaRefs>
 </ds:datastoreItem>
 </file>
 
-<file path=customXml/itemProps4.xml><?xml version="1.0" encoding="utf-8"?>
+<file path=customXml/itemProps3.xml><?xml version="1.0" encoding="utf-8"?>
 <ds:datastoreItem xmlns:ds="http://schemas.openxmlformats.org/officeDocument/2006/customXml" ds:itemID="{2C612DAB-883E-427E-82DE-EEBD0984ED6D}">
   <ds:schemaRefs>
     <ds:schemaRef ds:uri="http://schemas.microsoft.com/office/2006/metadata/contentType"/>
@@ -2430,4 +4623,12 @@
     <ds:schemaRef ds:uri="http://schemas.microsoft.com/internal/obd"/>
   </ds:schemaRefs>
 </ds:datastoreItem>
+</file>
+
+<file path=customXml/itemProps4.xml><?xml version="1.0" encoding="utf-8"?>
+<ds:datastoreItem xmlns:ds="http://schemas.openxmlformats.org/officeDocument/2006/customXml" ds:itemID="{8D5DC332-1805-4342-B2BA-89BF91289DE0}">
+  <ds:schemaRefs>
+    <ds:schemaRef ds:uri="http://schemas.openxmlformats.org/officeDocument/2006/bibliography"/>
+  </ds:schemaRefs>
+</ds:datastoreItem>
 </file>
</xml_diff>